<commit_message>
Add #106 NSDF (accepted CiSE, DOI 10.1109/MCSE.2026.3733031) and #107 Altermagnet Talking Database (submitted); mark #102 Attention as accepted at PRX: Intelligence; add ICM International Advisory Committee to Service and Leadership; extend 2026 students (Matthew Long CORE Georgetown, 4 Berkeley Digital Discovery students, Baggett -> Johns Hopkins)
</commit_message>
<xml_diff>
--- a/william_ratcliff_cv.docx
+++ b/william_ratcliff_cv.docx
@@ -724,6 +724,18 @@
           <w:bCs/>
         </w:rPr>
         <w:t xml:space="preserve">Editorial Board, PRX: Intelligence (2026-present)</w:t>
+      </w:r>
+    </w:p>
+    <w:p>
+      <w:pPr>
+        <w:pStyle w:val="Compact"/>
+        <w:numPr>
+          <w:ilvl w:val="0"/>
+          <w:numId w:val="1004"/>
+        </w:numPr>
+      </w:pPr>
+      <w:r>
+        <w:t xml:space="preserve">International Advisory Committee, International Conference on Magnetism (ICM) (2026-present)</w:t>
       </w:r>
     </w:p>
     <w:p>
@@ -1152,6 +1164,78 @@
         <w:pStyle w:val="FirstParagraph"/>
       </w:pPr>
       <w:r>
+        <w:t xml:space="preserve">107.</w:t>
+      </w:r>
+      <w:r>
+        <w:t xml:space="preserve"> </w:t>
+      </w:r>
+      <w:r>
+        <w:t xml:space="preserve">“Physics-Grounded Knowledge Base Construction for Altermagnets with Structure-Aware Document Reading and LLM Extraction: Altermagnet Talking Database”</w:t>
+      </w:r>
+      <w:r>
+        <w:t xml:space="preserve"> </w:t>
+      </w:r>
+      <w:r>
+        <w:t xml:space="preserve">- Susy Exists, Sougata Mardanya, Vineet Kumar Sharma, Matthew Matzelle, Arun Bansil, William Ratcliff, Sugata Chowdhury -</w:t>
+      </w:r>
+      <w:r>
+        <w:t xml:space="preserve"> </w:t>
+      </w:r>
+      <w:r>
+        <w:rPr>
+          <w:i/>
+          <w:iCs/>
+        </w:rPr>
+        <w:t xml:space="preserve">Nature Machine Intelligence</w:t>
+      </w:r>
+      <w:r>
+        <w:t xml:space="preserve"> </w:t>
+      </w:r>
+      <w:r>
+        <w:t xml:space="preserve">(submitted, 2026)</w:t>
+      </w:r>
+    </w:p>
+    <w:p>
+      <w:pPr>
+        <w:pStyle w:val="BodyText"/>
+      </w:pPr>
+      <w:r>
+        <w:t xml:space="preserve">106.</w:t>
+      </w:r>
+      <w:r>
+        <w:t xml:space="preserve"> </w:t>
+      </w:r>
+      <w:r>
+        <w:t xml:space="preserve">“The National Science Data Fabric as a Digital Backbone for AI-Guided Neutron Experiments”</w:t>
+      </w:r>
+      <w:r>
+        <w:t xml:space="preserve"> </w:t>
+      </w:r>
+      <w:r>
+        <w:t xml:space="preserve">- Jack Marquez, Kin Hong Ng, Lance Drane, Gregory R. Watson, Kaz Gofron, Bogdan Vacaliuc, Zach Thurman, Gregory Cage, Gavin Wiggins, Cody Stiner, Jesse McGaha, Andrew Ayres, Robert Smith, Greg Watson, Addi Malviya Thakur, Yuanpeng Zhang, Jue Liu, Stephen DeWitt, Ankit Shrivastava, Paul Laiu, Craig Bridges, Mathieu Doucet, Matt Tucker, Emily R. Van Auken, Luke Daemen, Marie Backman, Darsh Dinger, Melanie Kirkham, Thomas Proffen, Austin McDannald, Gilad Kusne, William Ratcliff, Amy Gooch, Giorgio Scorzelli, Valerio Pascucci, Marshall McDonnell, Ben Mintz, Rob Moore, Michela Taufer -</w:t>
+      </w:r>
+      <w:r>
+        <w:t xml:space="preserve"> </w:t>
+      </w:r>
+      <w:r>
+        <w:rPr>
+          <w:i/>
+          <w:iCs/>
+        </w:rPr>
+        <w:t xml:space="preserve">Computing in Science &amp; Engineering</w:t>
+      </w:r>
+      <w:r>
+        <w:t xml:space="preserve"> </w:t>
+      </w:r>
+      <w:r>
+        <w:t xml:space="preserve">(accepted, 2026), DOI: 10.1109/MCSE.2026.3733031</w:t>
+      </w:r>
+    </w:p>
+    <w:p>
+      <w:pPr>
+        <w:pStyle w:val="BodyText"/>
+      </w:pPr>
+      <w:r>
         <w:t xml:space="preserve">105.</w:t>
       </w:r>
       <w:r>
@@ -1250,7 +1334,7 @@
         <w:t xml:space="preserve"> </w:t>
       </w:r>
       <w:r>
-        <w:t xml:space="preserve">- Elizabeth J. Baggett, Edward G. Friedman, Abhishek Shetty, Derrick Chan-Sew, Vanellsa Acha, Harshita Dwarcherla, Paul Kienzle, William Ratcliff - arXiv:2604.23811, DOI: 10.48550/arXiv.2604.23811 (2026) (under review at</w:t>
+        <w:t xml:space="preserve">- Elizabeth J. Baggett, Edward G. Friedman, Abhishek Shetty, Derrick Chan-Sew, Vanellsa Acha, Harshita Dwarcherla, Paul Kienzle, William Ratcliff - arXiv:2604.23811, DOI: 10.48550/arXiv.2604.23811 (accepted,</w:t>
       </w:r>
       <w:r>
         <w:t xml:space="preserve"> </w:t>
@@ -1263,7 +1347,7 @@
         <w:t xml:space="preserve">PRX: Intelligence</w:t>
       </w:r>
       <w:r>
-        <w:t xml:space="preserve">)</w:t>
+        <w:t xml:space="preserve">, 2026)</w:t>
       </w:r>
     </w:p>
     <w:p>

</xml_diff>

<commit_message>
Mark #105 Fruhling arXiv paper as under review at *Physical Review Materials*; confirm #102 Attention accepted at PRX: Intelligence and #106 CiSE NSDF accepted with DOI
Co-Authored-By: Claude Opus 4.7 (1M context) <noreply@anthropic.com>
</commit_message>
<xml_diff>
--- a/william_ratcliff_cv.docx
+++ b/william_ratcliff_cv.docx
@@ -10,7 +10,7 @@
         <w:t xml:space="preserve">CV</w:t>
       </w:r>
     </w:p>
-    <w:bookmarkStart w:id="63" w:name="dr.-william-ratcliff-ii"/>
+    <w:bookmarkStart w:id="52" w:name="dr.-william-ratcliff-ii"/>
     <w:p>
       <w:pPr>
         <w:pStyle w:val="Heading1"/>
@@ -56,7 +56,7 @@
         </w:pict>
       </w:r>
     </w:p>
-    <w:bookmarkStart w:id="20" w:name="education"/>
+    <w:bookmarkStart w:id="9" w:name="education"/>
     <w:p>
       <w:pPr>
         <w:pStyle w:val="Heading2"/>
@@ -118,8 +118,8 @@
         </w:pict>
       </w:r>
     </w:p>
-    <w:bookmarkEnd w:id="20"/>
-    <w:bookmarkStart w:id="21" w:name="research-interests"/>
+    <w:bookmarkEnd w:id="9"/>
+    <w:bookmarkStart w:id="10" w:name="research-interests"/>
     <w:p>
       <w:pPr>
         <w:pStyle w:val="Heading2"/>
@@ -220,8 +220,8 @@
         </w:pict>
       </w:r>
     </w:p>
-    <w:bookmarkEnd w:id="21"/>
-    <w:bookmarkStart w:id="22" w:name="careerexperience"/>
+    <w:bookmarkEnd w:id="10"/>
+    <w:bookmarkStart w:id="11" w:name="careerexperience"/>
     <w:p>
       <w:pPr>
         <w:pStyle w:val="Heading2"/>
@@ -327,8 +327,8 @@
         </w:pict>
       </w:r>
     </w:p>
-    <w:bookmarkEnd w:id="22"/>
-    <w:bookmarkStart w:id="23" w:name="workshops-organized"/>
+    <w:bookmarkEnd w:id="11"/>
+    <w:bookmarkStart w:id="12" w:name="workshops-organized"/>
     <w:p>
       <w:pPr>
         <w:pStyle w:val="Heading2"/>
@@ -560,8 +560,8 @@
         </w:pict>
       </w:r>
     </w:p>
-    <w:bookmarkEnd w:id="23"/>
-    <w:bookmarkStart w:id="24" w:name="grants"/>
+    <w:bookmarkEnd w:id="12"/>
+    <w:bookmarkStart w:id="13" w:name="grants"/>
     <w:p>
       <w:pPr>
         <w:pStyle w:val="Heading2"/>
@@ -601,8 +601,8 @@
         </w:pict>
       </w:r>
     </w:p>
-    <w:bookmarkEnd w:id="24"/>
-    <w:bookmarkStart w:id="28" w:name="honors-service-and-memberships"/>
+    <w:bookmarkEnd w:id="13"/>
+    <w:bookmarkStart w:id="17" w:name="honors-service-and-memberships"/>
     <w:p>
       <w:pPr>
         <w:pStyle w:val="Heading2"/>
@@ -611,7 +611,7 @@
         <w:t xml:space="preserve">Honors, Service, and Memberships</w:t>
       </w:r>
     </w:p>
-    <w:bookmarkStart w:id="25" w:name="honors"/>
+    <w:bookmarkStart w:id="14" w:name="honors"/>
     <w:p>
       <w:pPr>
         <w:pStyle w:val="Heading3"/>
@@ -684,8 +684,8 @@
         <w:t xml:space="preserve">NRC Postdoctoral Fellowship (2003-2005)</w:t>
       </w:r>
     </w:p>
-    <w:bookmarkEnd w:id="25"/>
-    <w:bookmarkStart w:id="26" w:name="service-and-leadership"/>
+    <w:bookmarkEnd w:id="14"/>
+    <w:bookmarkStart w:id="15" w:name="service-and-leadership"/>
     <w:p>
       <w:pPr>
         <w:pStyle w:val="Heading3"/>
@@ -954,8 +954,8 @@
         <w:t xml:space="preserve">Elected ACA Neutron Scattering Special Interest Group Chair (2015-2016)</w:t>
       </w:r>
     </w:p>
-    <w:bookmarkEnd w:id="26"/>
-    <w:bookmarkStart w:id="27" w:name="memberships"/>
+    <w:bookmarkEnd w:id="15"/>
+    <w:bookmarkStart w:id="16" w:name="memberships"/>
     <w:p>
       <w:pPr>
         <w:pStyle w:val="Heading3"/>
@@ -1019,9 +1019,9 @@
         </w:pict>
       </w:r>
     </w:p>
-    <w:bookmarkEnd w:id="27"/>
-    <w:bookmarkEnd w:id="28"/>
-    <w:bookmarkStart w:id="33" w:name="publications"/>
+    <w:bookmarkEnd w:id="16"/>
+    <w:bookmarkEnd w:id="17"/>
+    <w:bookmarkStart w:id="22" w:name="publications"/>
     <w:p>
       <w:pPr>
         <w:pStyle w:val="Heading2"/>
@@ -1030,7 +1030,7 @@
         <w:t xml:space="preserve">Publications</w:t>
       </w:r>
     </w:p>
-    <w:bookmarkStart w:id="30" w:name="metrics"/>
+    <w:bookmarkStart w:id="19" w:name="metrics"/>
     <w:p>
       <w:pPr>
         <w:pStyle w:val="Heading3"/>
@@ -1060,7 +1060,7 @@
       <w:r>
         <w:t xml:space="preserve">48 (</w:t>
       </w:r>
-      <w:hyperlink r:id="rId29">
+      <w:hyperlink r:id="rId18">
         <w:r>
           <w:rPr>
             <w:rStyle w:val="Hyperlink"/>
@@ -1094,8 +1094,8 @@
         <w:t xml:space="preserve">&gt;9000</w:t>
       </w:r>
     </w:p>
-    <w:bookmarkEnd w:id="30"/>
-    <w:bookmarkStart w:id="31" w:name="book-chapters"/>
+    <w:bookmarkEnd w:id="19"/>
+    <w:bookmarkStart w:id="20" w:name="book-chapters"/>
     <w:p>
       <w:pPr>
         <w:pStyle w:val="Heading3"/>
@@ -1149,8 +1149,8 @@
         <w:t xml:space="preserve">(Royal Society of Chemistry, forthcoming)</w:t>
       </w:r>
     </w:p>
-    <w:bookmarkEnd w:id="31"/>
-    <w:bookmarkStart w:id="32" w:name="publications-1"/>
+    <w:bookmarkEnd w:id="20"/>
+    <w:bookmarkStart w:id="21" w:name="publications-1"/>
     <w:p>
       <w:pPr>
         <w:pStyle w:val="Heading3"/>
@@ -1248,7 +1248,20 @@
         <w:t xml:space="preserve"> </w:t>
       </w:r>
       <w:r>
-        <w:t xml:space="preserve">- Kyle Fruhling, Jonathan Gaudet, William Ratcliff, Jonathan S. White, Siddharth Nandanwar, Noah J. Fau, Gregory T. McCandless, Enrique O. González Delgado, et al. - arXiv:2608.21633, DOI: 10.48550/arXiv.2608.21633 (2026)</w:t>
+        <w:t xml:space="preserve">- Kyle Fruhling, Jonathan Gaudet, William Ratcliff, Jonathan S. White, Siddharth Nandanwar, Noah J. Fau, Gregory T. McCandless, Enrique O. González Delgado, et al. - arXiv:2608.21633, DOI: 10.48550/arXiv.2608.21633 (under review,</w:t>
+      </w:r>
+      <w:r>
+        <w:t xml:space="preserve"> </w:t>
+      </w:r>
+      <w:r>
+        <w:rPr>
+          <w:i/>
+          <w:iCs/>
+        </w:rPr>
+        <w:t xml:space="preserve">Physical Review Materials</w:t>
+      </w:r>
+      <w:r>
+        <w:t xml:space="preserve">, 2026)</w:t>
       </w:r>
     </w:p>
     <w:p>
@@ -5696,371 +5709,1490 @@
         </w:pict>
       </w:r>
     </w:p>
+    <w:bookmarkEnd w:id="21"/>
+    <w:bookmarkEnd w:id="22"/>
+    <w:bookmarkStart w:id="50" w:name="selected-conference-talksposters"/>
+    <w:p>
+      <w:pPr>
+        <w:pStyle w:val="Heading2"/>
+      </w:pPr>
+      <w:r>
+        <w:t xml:space="preserve">Selected Conference Talks/Posters</w:t>
+      </w:r>
+    </w:p>
+    <w:bookmarkStart w:id="23" w:name="section"/>
+    <w:p>
+      <w:pPr>
+        <w:pStyle w:val="Heading3"/>
+      </w:pPr>
+      <w:r>
+        <w:t xml:space="preserve">2026</w:t>
+      </w:r>
+    </w:p>
+    <w:p>
+      <w:pPr>
+        <w:pStyle w:val="Compact"/>
+        <w:numPr>
+          <w:ilvl w:val="0"/>
+          <w:numId w:val="1007"/>
+        </w:numPr>
+      </w:pPr>
+      <w:r>
+        <w:t xml:space="preserve">“Crystal Communities”</w:t>
+      </w:r>
+      <w:r>
+        <w:t xml:space="preserve">, Enhanced Functionalities in 4 and 5d Containing Materials from Large Spin-Orbit Coupling Workshop, Telluride Science Research Center, Telluride, CO (invited)</w:t>
+      </w:r>
+    </w:p>
+    <w:p>
+      <w:pPr>
+        <w:pStyle w:val="Compact"/>
+        <w:numPr>
+          <w:ilvl w:val="0"/>
+          <w:numId w:val="1007"/>
+        </w:numPr>
+      </w:pPr>
+      <w:r>
+        <w:t xml:space="preserve">“Experimental Aspects of Neutron Diffraction”</w:t>
+      </w:r>
+      <w:r>
+        <w:t xml:space="preserve">, Magnetic Structure Determination from Neutron Diffraction Data (MagStr 2026), Duke University, Durham, NC (invited)</w:t>
+      </w:r>
+    </w:p>
+    <w:p>
+      <w:pPr>
+        <w:pStyle w:val="Compact"/>
+        <w:numPr>
+          <w:ilvl w:val="0"/>
+          <w:numId w:val="1007"/>
+        </w:numPr>
+      </w:pPr>
+      <w:r>
+        <w:t xml:space="preserve">“Attention Is Not All You Need for Diffraction”</w:t>
+      </w:r>
+      <w:r>
+        <w:t xml:space="preserve">, 13th American Conference on Neutron Scattering (ACNS 2026), Detroit Marriott at the Renaissance Center, Detroit, MI (invited)</w:t>
+      </w:r>
+    </w:p>
+    <w:p>
+      <w:pPr>
+        <w:pStyle w:val="Compact"/>
+        <w:numPr>
+          <w:ilvl w:val="0"/>
+          <w:numId w:val="1007"/>
+        </w:numPr>
+      </w:pPr>
+      <w:r>
+        <w:t xml:space="preserve">“Attention Is Not All You Need for Diffraction”</w:t>
+      </w:r>
+      <w:r>
+        <w:t xml:space="preserve">, Machine Learning for X-ray and Neutron Science (MLXN) 2026, AGU Conference Center, Washington, DC (invited)</w:t>
+      </w:r>
+    </w:p>
+    <w:p>
+      <w:pPr>
+        <w:pStyle w:val="Compact"/>
+        <w:numPr>
+          <w:ilvl w:val="0"/>
+          <w:numId w:val="1007"/>
+        </w:numPr>
+      </w:pPr>
+      <w:r>
+        <w:t xml:space="preserve">“Attention Is Not All You Need for Diffraction”</w:t>
+      </w:r>
+      <w:r>
+        <w:t xml:space="preserve">, Artificial Intelligence for Materials Science (AIMS) 2026, NIST, Gaithersburg, MD (invited)</w:t>
+      </w:r>
+    </w:p>
+    <w:p>
+      <w:pPr>
+        <w:pStyle w:val="Compact"/>
+        <w:numPr>
+          <w:ilvl w:val="0"/>
+          <w:numId w:val="1007"/>
+        </w:numPr>
+      </w:pPr>
+      <w:r>
+        <w:t xml:space="preserve">“Attention is Not All You Need: For Diffraction”</w:t>
+      </w:r>
+      <w:r>
+        <w:t xml:space="preserve">, Frontiers of AI-Realized Metastable Materials Workshop, National Academies of Sciences, Engineering, and Medicine (Condensed Matter and Materials Research Committee), Keck Center, Washington, DC (invited)</w:t>
+      </w:r>
+    </w:p>
+    <w:p>
+      <w:pPr>
+        <w:pStyle w:val="Compact"/>
+        <w:numPr>
+          <w:ilvl w:val="0"/>
+          <w:numId w:val="1007"/>
+        </w:numPr>
+      </w:pPr>
+      <w:r>
+        <w:t xml:space="preserve">“AI and Neutron Scattering”</w:t>
+      </w:r>
+      <w:r>
+        <w:t xml:space="preserve">, Gordon Research Conference on Multifunctional Materials and Structures: Enabling Multifunctionality through AI Informed Material Discovery and System Design, Ventura, CA (invited)</w:t>
+      </w:r>
+    </w:p>
+    <w:p>
+      <w:pPr>
+        <w:pStyle w:val="Compact"/>
+        <w:numPr>
+          <w:ilvl w:val="0"/>
+          <w:numId w:val="1007"/>
+        </w:numPr>
+      </w:pPr>
+      <w:r>
+        <w:t xml:space="preserve">“Introduction to Neural Networks”</w:t>
+      </w:r>
+      <w:r>
+        <w:t xml:space="preserve">, Short Course: Data Science for Physicists I, APS Global Physics Summit, Denver, CO (invited)</w:t>
+      </w:r>
+    </w:p>
+    <w:p>
+      <w:pPr>
+        <w:pStyle w:val="Compact"/>
+        <w:numPr>
+          <w:ilvl w:val="0"/>
+          <w:numId w:val="1007"/>
+        </w:numPr>
+      </w:pPr>
+      <w:r>
+        <w:t xml:space="preserve">“AI and Neutron Scattering”</w:t>
+      </w:r>
+      <w:r>
+        <w:t xml:space="preserve">, Department of Physics, George Mason University (April 2026) (invited)</w:t>
+      </w:r>
+    </w:p>
+    <w:p>
+      <w:pPr>
+        <w:pStyle w:val="Compact"/>
+        <w:numPr>
+          <w:ilvl w:val="0"/>
+          <w:numId w:val="1007"/>
+        </w:numPr>
+      </w:pPr>
+      <w:r>
+        <w:t xml:space="preserve">“Attention is not all you need: Comparing the performance of transformers and CNNs in classifying space groups from powder diffraction data”</w:t>
+      </w:r>
+      <w:r>
+        <w:t xml:space="preserve">, APS Global Physics Summit, Denver, CO</w:t>
+      </w:r>
+    </w:p>
+    <w:bookmarkEnd w:id="23"/>
+    <w:bookmarkStart w:id="24" w:name="section-1"/>
+    <w:p>
+      <w:pPr>
+        <w:pStyle w:val="Heading3"/>
+      </w:pPr>
+      <w:r>
+        <w:t xml:space="preserve">2025</w:t>
+      </w:r>
+    </w:p>
+    <w:p>
+      <w:pPr>
+        <w:pStyle w:val="Compact"/>
+        <w:numPr>
+          <w:ilvl w:val="0"/>
+          <w:numId w:val="1008"/>
+        </w:numPr>
+      </w:pPr>
+      <w:r>
+        <w:t xml:space="preserve">“Single Crystal Diffraction”</w:t>
+      </w:r>
+      <w:r>
+        <w:t xml:space="preserve">, 1st Neutron Scattering School (invited)</w:t>
+      </w:r>
+    </w:p>
+    <w:p>
+      <w:pPr>
+        <w:pStyle w:val="Compact"/>
+        <w:numPr>
+          <w:ilvl w:val="0"/>
+          <w:numId w:val="1008"/>
+        </w:numPr>
+      </w:pPr>
+      <w:r>
+        <w:t xml:space="preserve">“Accelerating Materials Discovery: The Role of AI in Neutron Scattering Research”</w:t>
+      </w:r>
+      <w:r>
+        <w:t xml:space="preserve">, American Physical Society Global Physics Summit, Anaheim, CA (invited)</w:t>
+      </w:r>
+    </w:p>
+    <w:p>
+      <w:pPr>
+        <w:pStyle w:val="Compact"/>
+        <w:numPr>
+          <w:ilvl w:val="0"/>
+          <w:numId w:val="1008"/>
+        </w:numPr>
+      </w:pPr>
+      <w:r>
+        <w:t xml:space="preserve">“Neural Networks for Physicists”</w:t>
+      </w:r>
+      <w:r>
+        <w:t xml:space="preserve">, Data Science for Physicists Short Course, American Physical Society Global Physics Summit, Anaheim, CA (invited)</w:t>
+      </w:r>
+    </w:p>
+    <w:p>
+      <w:pPr>
+        <w:pStyle w:val="Compact"/>
+        <w:numPr>
+          <w:ilvl w:val="0"/>
+          <w:numId w:val="1008"/>
+        </w:numPr>
+      </w:pPr>
+      <w:r>
+        <w:t xml:space="preserve">“Applications of Artificial Intelligence to Neutron Scattering”</w:t>
+      </w:r>
+      <w:r>
+        <w:t xml:space="preserve">, Department of Physics, James Madison University (invited)</w:t>
+      </w:r>
+    </w:p>
+    <w:p>
+      <w:pPr>
+        <w:pStyle w:val="Compact"/>
+        <w:numPr>
+          <w:ilvl w:val="0"/>
+          <w:numId w:val="1008"/>
+        </w:numPr>
+      </w:pPr>
+      <w:r>
+        <w:t xml:space="preserve">“Applications of Artificial Intelligence to Neutron Scattering”</w:t>
+      </w:r>
+      <w:r>
+        <w:t xml:space="preserve">, Department of Physics, University of Buffalo (invited)</w:t>
+      </w:r>
+    </w:p>
+    <w:p>
+      <w:pPr>
+        <w:pStyle w:val="Compact"/>
+        <w:numPr>
+          <w:ilvl w:val="0"/>
+          <w:numId w:val="1008"/>
+        </w:numPr>
+      </w:pPr>
+      <w:r>
+        <w:t xml:space="preserve">“Applications of Artificial Intelligence to Neutron Scattering”</w:t>
+      </w:r>
+      <w:r>
+        <w:t xml:space="preserve">, Georgetown Data Science and Analytics Program (invited)</w:t>
+      </w:r>
+    </w:p>
+    <w:bookmarkEnd w:id="24"/>
+    <w:bookmarkStart w:id="25" w:name="section-2"/>
+    <w:p>
+      <w:pPr>
+        <w:pStyle w:val="Heading3"/>
+      </w:pPr>
+      <w:r>
+        <w:t xml:space="preserve">2024</w:t>
+      </w:r>
+    </w:p>
+    <w:p>
+      <w:pPr>
+        <w:pStyle w:val="Compact"/>
+        <w:numPr>
+          <w:ilvl w:val="0"/>
+          <w:numId w:val="1009"/>
+        </w:numPr>
+      </w:pPr>
+      <w:r>
+        <w:t xml:space="preserve">“Single Crystal Diffraction”</w:t>
+      </w:r>
+      <w:r>
+        <w:t xml:space="preserve">, Neutron X-Ray School (invited)</w:t>
+      </w:r>
+    </w:p>
+    <w:p>
+      <w:pPr>
+        <w:pStyle w:val="Compact"/>
+        <w:numPr>
+          <w:ilvl w:val="0"/>
+          <w:numId w:val="1009"/>
+        </w:numPr>
+      </w:pPr>
+      <w:r>
+        <w:t xml:space="preserve">“Applications of Artificial Intelligence to Neutron Scattering”</w:t>
+      </w:r>
+      <w:r>
+        <w:t xml:space="preserve">, Department of Physics, Johns Hopkins (invited)</w:t>
+      </w:r>
+    </w:p>
+    <w:p>
+      <w:pPr>
+        <w:pStyle w:val="Compact"/>
+        <w:numPr>
+          <w:ilvl w:val="0"/>
+          <w:numId w:val="1009"/>
+        </w:numPr>
+      </w:pPr>
+      <w:r>
+        <w:t xml:space="preserve">“Experimental Aspects of magnetic structure determination”</w:t>
+      </w:r>
+      <w:r>
+        <w:t xml:space="preserve">, Magnetic Structure School, Kennesaw State University (invited)</w:t>
+      </w:r>
+    </w:p>
+    <w:p>
+      <w:pPr>
+        <w:pStyle w:val="Compact"/>
+        <w:numPr>
+          <w:ilvl w:val="0"/>
+          <w:numId w:val="1009"/>
+        </w:numPr>
+      </w:pPr>
+      <w:r>
+        <w:t xml:space="preserve">“Incorporating Data Science in the Undergraduate Physics Curriculum”</w:t>
+      </w:r>
+      <w:r>
+        <w:t xml:space="preserve">, March Meeting of the American Physical Society (invited)</w:t>
+      </w:r>
+    </w:p>
+    <w:p>
+      <w:pPr>
+        <w:pStyle w:val="Compact"/>
+        <w:numPr>
+          <w:ilvl w:val="0"/>
+          <w:numId w:val="1009"/>
+        </w:numPr>
+      </w:pPr>
+      <w:r>
+        <w:t xml:space="preserve">“Unsupervised Learning for Physicists”</w:t>
+      </w:r>
+      <w:r>
+        <w:t xml:space="preserve">, Data Science for Physicists Tutorial, American Physical Society Global Physics Summit (invited)</w:t>
+      </w:r>
+    </w:p>
+    <w:p>
+      <w:pPr>
+        <w:pStyle w:val="Compact"/>
+        <w:numPr>
+          <w:ilvl w:val="0"/>
+          <w:numId w:val="1009"/>
+        </w:numPr>
+      </w:pPr>
+      <w:r>
+        <w:t xml:space="preserve">“Mapping the ICSD”</w:t>
+      </w:r>
+      <w:r>
+        <w:t xml:space="preserve">, March Meeting of the American Physical Society</w:t>
+      </w:r>
+    </w:p>
+    <w:p>
+      <w:pPr>
+        <w:pStyle w:val="Compact"/>
+        <w:numPr>
+          <w:ilvl w:val="0"/>
+          <w:numId w:val="1009"/>
+        </w:numPr>
+      </w:pPr>
+      <w:r>
+        <w:t xml:space="preserve">“Neutron Scattering and AI”</w:t>
+      </w:r>
+      <w:r>
+        <w:t xml:space="preserve"> </w:t>
+      </w:r>
+      <w:r>
+        <w:t xml:space="preserve">(and panel), Neutron PI meeting, Rockville, MD (invited)</w:t>
+      </w:r>
+    </w:p>
+    <w:p>
+      <w:pPr>
+        <w:pStyle w:val="Compact"/>
+        <w:numPr>
+          <w:ilvl w:val="0"/>
+          <w:numId w:val="1009"/>
+        </w:numPr>
+      </w:pPr>
+      <w:r>
+        <w:t xml:space="preserve">“Semi and Self Supervised approaches to Space Group and Bravais Lattice Determination”</w:t>
+      </w:r>
+      <w:r>
+        <w:t xml:space="preserve">, Electronic Materials and Applications 2024, Denver, CO (invited)</w:t>
+      </w:r>
+    </w:p>
+    <w:p>
+      <w:pPr>
+        <w:pStyle w:val="Compact"/>
+        <w:numPr>
+          <w:ilvl w:val="0"/>
+          <w:numId w:val="1009"/>
+        </w:numPr>
+      </w:pPr>
+      <w:r>
+        <w:t xml:space="preserve">“Quantum Materials at NIST”</w:t>
+      </w:r>
+      <w:r>
+        <w:t xml:space="preserve">, Quantum Noir, Harvard University (invited)</w:t>
+      </w:r>
+    </w:p>
+    <w:p>
+      <w:pPr>
+        <w:pStyle w:val="Compact"/>
+        <w:numPr>
+          <w:ilvl w:val="0"/>
+          <w:numId w:val="1009"/>
+        </w:numPr>
+      </w:pPr>
+      <w:r>
+        <w:t xml:space="preserve">“Applications of Artificial Intelligence to Neutron Scattering”</w:t>
+      </w:r>
+      <w:r>
+        <w:t xml:space="preserve">, Department of Physics, Georgetown University (invited)</w:t>
+      </w:r>
+    </w:p>
+    <w:p>
+      <w:pPr>
+        <w:pStyle w:val="Compact"/>
+        <w:numPr>
+          <w:ilvl w:val="0"/>
+          <w:numId w:val="1009"/>
+        </w:numPr>
+      </w:pPr>
+      <w:r>
+        <w:t xml:space="preserve">“Semi and Self Supervised approaches to Space Group and Bravais Lattice Determination”</w:t>
+      </w:r>
+      <w:r>
+        <w:t xml:space="preserve">, Machine Learning Conference for X-Ray and Neutron-Based Experiments, FRM2, Garching, Germany</w:t>
+      </w:r>
+    </w:p>
+    <w:p>
+      <w:pPr>
+        <w:pStyle w:val="Compact"/>
+        <w:numPr>
+          <w:ilvl w:val="0"/>
+          <w:numId w:val="1009"/>
+        </w:numPr>
+      </w:pPr>
+      <w:r>
+        <w:t xml:space="preserve">“Applications of Artificial Intelligence to Neutron Scattering”</w:t>
+      </w:r>
+      <w:r>
+        <w:t xml:space="preserve">, Bakar Institute of Digital Materials for the Planet, Berkeley (invited)</w:t>
+      </w:r>
+    </w:p>
+    <w:p>
+      <w:pPr>
+        <w:pStyle w:val="Compact"/>
+        <w:numPr>
+          <w:ilvl w:val="0"/>
+          <w:numId w:val="1009"/>
+        </w:numPr>
+      </w:pPr>
+      <w:r>
+        <w:t xml:space="preserve">“Applications of Artificial Intelligence to Neutron Scattering”</w:t>
+      </w:r>
+      <w:r>
+        <w:t xml:space="preserve">, Department of Physics, University of Illinois (invited)</w:t>
+      </w:r>
+    </w:p>
+    <w:p>
+      <w:pPr>
+        <w:pStyle w:val="Compact"/>
+        <w:numPr>
+          <w:ilvl w:val="0"/>
+          <w:numId w:val="1009"/>
+        </w:numPr>
+      </w:pPr>
+      <w:r>
+        <w:t xml:space="preserve">“Adventures in Kagome Flat Band, ErMn6Sn6”</w:t>
+      </w:r>
+      <w:r>
+        <w:t xml:space="preserve">, Telluride Workshop, Telluride, CO (invited)</w:t>
+      </w:r>
+    </w:p>
+    <w:p>
+      <w:pPr>
+        <w:pStyle w:val="Compact"/>
+        <w:numPr>
+          <w:ilvl w:val="0"/>
+          <w:numId w:val="1009"/>
+        </w:numPr>
+      </w:pPr>
+      <w:r>
+        <w:t xml:space="preserve">“Applications of AI to crystal structure determination from powder diffraction data”</w:t>
+      </w:r>
+      <w:r>
+        <w:t xml:space="preserve">, European Crystallography Meeting/European Powder Diffraction meeting, Padova, Italy</w:t>
+      </w:r>
+    </w:p>
+    <w:bookmarkEnd w:id="25"/>
+    <w:bookmarkStart w:id="26" w:name="section-3"/>
+    <w:p>
+      <w:pPr>
+        <w:pStyle w:val="Heading3"/>
+      </w:pPr>
+      <w:r>
+        <w:t xml:space="preserve">2023</w:t>
+      </w:r>
+    </w:p>
+    <w:p>
+      <w:pPr>
+        <w:pStyle w:val="Compact"/>
+        <w:numPr>
+          <w:ilvl w:val="0"/>
+          <w:numId w:val="1010"/>
+        </w:numPr>
+      </w:pPr>
+      <w:r>
+        <w:t xml:space="preserve">“Integrating Data Science Into the Undergraduate Physics Curriculum”</w:t>
+      </w:r>
+      <w:r>
+        <w:t xml:space="preserve">, National Society of Black Physicists, Knoxville, TN</w:t>
+      </w:r>
+    </w:p>
+    <w:p>
+      <w:pPr>
+        <w:pStyle w:val="Compact"/>
+        <w:numPr>
+          <w:ilvl w:val="0"/>
+          <w:numId w:val="1010"/>
+        </w:numPr>
+      </w:pPr>
+      <w:r>
+        <w:t xml:space="preserve">“Semi and Self Supervised approaches to Space Group and Bravais Lattice Determination”</w:t>
+      </w:r>
+      <w:r>
+        <w:t xml:space="preserve">, Pittsburgh Diffraction Society, Pittsburgh (invited)</w:t>
+      </w:r>
+    </w:p>
+    <w:p>
+      <w:pPr>
+        <w:pStyle w:val="Compact"/>
+        <w:numPr>
+          <w:ilvl w:val="0"/>
+          <w:numId w:val="1010"/>
+        </w:numPr>
+      </w:pPr>
+      <w:r>
+        <w:t xml:space="preserve">“Semi and Self Supervised approaches to Space Group and Bravais Lattice Determination”</w:t>
+      </w:r>
+      <w:r>
+        <w:t xml:space="preserve">, March meeting of the American Physical Society, Las Vegas</w:t>
+      </w:r>
+    </w:p>
+    <w:p>
+      <w:pPr>
+        <w:pStyle w:val="Compact"/>
+        <w:numPr>
+          <w:ilvl w:val="0"/>
+          <w:numId w:val="1010"/>
+        </w:numPr>
+      </w:pPr>
+      <w:r>
+        <w:t xml:space="preserve">“Applications of Artificial Intelligence to Neutron Scattering”</w:t>
+      </w:r>
+      <w:r>
+        <w:t xml:space="preserve">, Department of Physics, North Carolina A&amp;T (invited)</w:t>
+      </w:r>
+    </w:p>
+    <w:p>
+      <w:pPr>
+        <w:pStyle w:val="Compact"/>
+        <w:numPr>
+          <w:ilvl w:val="0"/>
+          <w:numId w:val="1010"/>
+        </w:numPr>
+      </w:pPr>
+      <w:r>
+        <w:t xml:space="preserve">“Semi and Self Supervised approaches to Space Group and Bravais Lattice Determination”</w:t>
+      </w:r>
+      <w:r>
+        <w:t xml:space="preserve">, International Union of Crystallography, Melbourne, Australia</w:t>
+      </w:r>
+    </w:p>
+    <w:p>
+      <w:pPr>
+        <w:pStyle w:val="Compact"/>
+        <w:numPr>
+          <w:ilvl w:val="0"/>
+          <w:numId w:val="1010"/>
+        </w:numPr>
+      </w:pPr>
+      <w:r>
+        <w:t xml:space="preserve">“Semi and Self Supervised approaches to Space Group and Bravais Lattice Determination”</w:t>
+      </w:r>
+      <w:r>
+        <w:t xml:space="preserve">, American Chemical Society, San Francisco (invited)</w:t>
+      </w:r>
+    </w:p>
+    <w:p>
+      <w:pPr>
+        <w:pStyle w:val="Compact"/>
+        <w:numPr>
+          <w:ilvl w:val="0"/>
+          <w:numId w:val="1010"/>
+        </w:numPr>
+      </w:pPr>
+      <w:r>
+        <w:t xml:space="preserve">“Semi and Self Supervised approaches to Space Group and Bravais Lattice Determination”</w:t>
+      </w:r>
+      <w:r>
+        <w:t xml:space="preserve">, Strongly Correlated Electronic Systems, Incheon, Korea (invited)</w:t>
+      </w:r>
+    </w:p>
+    <w:p>
+      <w:pPr>
+        <w:pStyle w:val="Compact"/>
+        <w:numPr>
+          <w:ilvl w:val="0"/>
+          <w:numId w:val="1010"/>
+        </w:numPr>
+      </w:pPr>
+      <w:r>
+        <w:t xml:space="preserve">“Semi and Self Supervised approaches to Space Group and Bravais Lattice Determination”</w:t>
+      </w:r>
+      <w:r>
+        <w:t xml:space="preserve">, American Crystallography Association, Baltimore</w:t>
+      </w:r>
+    </w:p>
+    <w:p>
+      <w:pPr>
+        <w:pStyle w:val="Compact"/>
+        <w:numPr>
+          <w:ilvl w:val="0"/>
+          <w:numId w:val="1010"/>
+        </w:numPr>
+      </w:pPr>
+      <w:r>
+        <w:t xml:space="preserve">“Single Crystal Diffraction”</w:t>
+      </w:r>
+      <w:r>
+        <w:t xml:space="preserve">, Neutron X-Ray School (invited)</w:t>
+      </w:r>
+    </w:p>
+    <w:p>
+      <w:pPr>
+        <w:pStyle w:val="Compact"/>
+        <w:numPr>
+          <w:ilvl w:val="0"/>
+          <w:numId w:val="1010"/>
+        </w:numPr>
+      </w:pPr>
+      <w:r>
+        <w:t xml:space="preserve">“DEI Panel: Fermilab Collaboration”</w:t>
+      </w:r>
+      <w:r>
+        <w:t xml:space="preserve"> </w:t>
+      </w:r>
+      <w:r>
+        <w:t xml:space="preserve">Virtual</w:t>
+      </w:r>
+    </w:p>
+    <w:p>
+      <w:pPr>
+        <w:pStyle w:val="Compact"/>
+        <w:numPr>
+          <w:ilvl w:val="0"/>
+          <w:numId w:val="1010"/>
+        </w:numPr>
+      </w:pPr>
+      <w:r>
+        <w:t xml:space="preserve">“Panelist: The Evolution of Data Science Conference”</w:t>
+      </w:r>
+      <w:r>
+        <w:t xml:space="preserve">, Georgetown</w:t>
+      </w:r>
+    </w:p>
+    <w:bookmarkEnd w:id="26"/>
+    <w:bookmarkStart w:id="27" w:name="section-4"/>
+    <w:p>
+      <w:pPr>
+        <w:pStyle w:val="Heading3"/>
+      </w:pPr>
+      <w:r>
+        <w:t xml:space="preserve">2022</w:t>
+      </w:r>
+    </w:p>
+    <w:p>
+      <w:pPr>
+        <w:pStyle w:val="Compact"/>
+        <w:numPr>
+          <w:ilvl w:val="0"/>
+          <w:numId w:val="1011"/>
+        </w:numPr>
+      </w:pPr>
+      <w:r>
+        <w:t xml:space="preserve">“Applications of Artificial Intelligence to Neutron Scattering”</w:t>
+      </w:r>
+      <w:r>
+        <w:t xml:space="preserve">, Department of Physics, University of Connecticut (invited)</w:t>
+      </w:r>
+    </w:p>
+    <w:p>
+      <w:pPr>
+        <w:pStyle w:val="Compact"/>
+        <w:numPr>
+          <w:ilvl w:val="0"/>
+          <w:numId w:val="1011"/>
+        </w:numPr>
+      </w:pPr>
+      <w:r>
+        <w:t xml:space="preserve">“Neutron Investigations of Mn(Bi,Sb)2Te4”</w:t>
+      </w:r>
+      <w:r>
+        <w:t xml:space="preserve">, MRS Meeting, Honolulu</w:t>
+      </w:r>
+    </w:p>
+    <w:p>
+      <w:pPr>
+        <w:pStyle w:val="Compact"/>
+        <w:numPr>
+          <w:ilvl w:val="0"/>
+          <w:numId w:val="1011"/>
+        </w:numPr>
+      </w:pPr>
+      <w:r>
+        <w:t xml:space="preserve">“Using AI to Determine Space Group from Neutron Powder Diffraction Data”</w:t>
+      </w:r>
+      <w:r>
+        <w:t xml:space="preserve">, ACNS Meeting, Boulder</w:t>
+      </w:r>
+    </w:p>
+    <w:p>
+      <w:pPr>
+        <w:pStyle w:val="Compact"/>
+        <w:numPr>
+          <w:ilvl w:val="0"/>
+          <w:numId w:val="1011"/>
+        </w:numPr>
+      </w:pPr>
+      <w:r>
+        <w:t xml:space="preserve">“Reinforcement Learning and Neutron Scattering”</w:t>
+      </w:r>
+      <w:r>
+        <w:t xml:space="preserve">, APS March Meeting, Chicago</w:t>
+      </w:r>
+    </w:p>
+    <w:p>
+      <w:pPr>
+        <w:pStyle w:val="Compact"/>
+        <w:numPr>
+          <w:ilvl w:val="0"/>
+          <w:numId w:val="1011"/>
+        </w:numPr>
+      </w:pPr>
+      <w:r>
+        <w:t xml:space="preserve">“APS Inclusion, Diversity, and Equity Alliance (IDEA), Transforming the Culture of Physics”</w:t>
+      </w:r>
+      <w:r>
+        <w:t xml:space="preserve">, APS March Meeting, Chicago (invited)</w:t>
+      </w:r>
+    </w:p>
+    <w:p>
+      <w:pPr>
+        <w:pStyle w:val="Compact"/>
+        <w:numPr>
+          <w:ilvl w:val="0"/>
+          <w:numId w:val="1011"/>
+        </w:numPr>
+      </w:pPr>
+      <w:r>
+        <w:t xml:space="preserve">“Inelastic Neutron Scattering”</w:t>
+      </w:r>
+      <w:r>
+        <w:t xml:space="preserve">, APS March Meeting, Chicago (invited DMP Short Course Lecture)</w:t>
+      </w:r>
+    </w:p>
+    <w:bookmarkEnd w:id="27"/>
+    <w:bookmarkStart w:id="28" w:name="section-5"/>
+    <w:p>
+      <w:pPr>
+        <w:pStyle w:val="Heading3"/>
+      </w:pPr>
+      <w:r>
+        <w:t xml:space="preserve">2021</w:t>
+      </w:r>
+    </w:p>
+    <w:p>
+      <w:pPr>
+        <w:pStyle w:val="Compact"/>
+        <w:numPr>
+          <w:ilvl w:val="0"/>
+          <w:numId w:val="1012"/>
+        </w:numPr>
+      </w:pPr>
+      <w:r>
+        <w:t xml:space="preserve">Opening Plenary speaker, APS-IDEA workshop</w:t>
+      </w:r>
+    </w:p>
+    <w:p>
+      <w:pPr>
+        <w:pStyle w:val="Compact"/>
+        <w:numPr>
+          <w:ilvl w:val="0"/>
+          <w:numId w:val="1012"/>
+        </w:numPr>
+      </w:pPr>
+      <w:r>
+        <w:t xml:space="preserve">“ORNL Postdoc Career Panel”</w:t>
+      </w:r>
+      <w:r>
+        <w:t xml:space="preserve">, Oak Ridge National Laboratory (invited)</w:t>
+      </w:r>
+    </w:p>
+    <w:p>
+      <w:pPr>
+        <w:pStyle w:val="Compact"/>
+        <w:numPr>
+          <w:ilvl w:val="0"/>
+          <w:numId w:val="1012"/>
+        </w:numPr>
+      </w:pPr>
+      <w:r>
+        <w:t xml:space="preserve">“Investigations of the first intrinsic topological insulator: MnBi2Te4”</w:t>
+      </w:r>
+      <w:r>
+        <w:t xml:space="preserve">, University of Maryland, College Park (virtual) (invited)</w:t>
+      </w:r>
+    </w:p>
+    <w:p>
+      <w:pPr>
+        <w:pStyle w:val="Compact"/>
+        <w:numPr>
+          <w:ilvl w:val="0"/>
+          <w:numId w:val="1012"/>
+        </w:numPr>
+      </w:pPr>
+      <w:r>
+        <w:t xml:space="preserve">“Investigations of the first intrinsic topological insulator: MnBi2Te4”</w:t>
+      </w:r>
+      <w:r>
+        <w:t xml:space="preserve">, UC Santa Cruz (virtual) (invited)</w:t>
+      </w:r>
+    </w:p>
+    <w:p>
+      <w:pPr>
+        <w:pStyle w:val="Compact"/>
+        <w:numPr>
+          <w:ilvl w:val="0"/>
+          <w:numId w:val="1012"/>
+        </w:numPr>
+      </w:pPr>
+      <w:r>
+        <w:t xml:space="preserve">“Reinforcement Learning to optimize crystal structure determination”</w:t>
+      </w:r>
+      <w:r>
+        <w:t xml:space="preserve">, March Meeting of the American Physical Society, Nashville, TN (virtual)</w:t>
+      </w:r>
+    </w:p>
+    <w:bookmarkEnd w:id="28"/>
+    <w:bookmarkStart w:id="29" w:name="section-6"/>
+    <w:p>
+      <w:pPr>
+        <w:pStyle w:val="Heading3"/>
+      </w:pPr>
+      <w:r>
+        <w:t xml:space="preserve">2020</w:t>
+      </w:r>
+    </w:p>
+    <w:p>
+      <w:pPr>
+        <w:pStyle w:val="Compact"/>
+        <w:numPr>
+          <w:ilvl w:val="0"/>
+          <w:numId w:val="1013"/>
+        </w:numPr>
+      </w:pPr>
+      <w:r>
+        <w:t xml:space="preserve">“Investigations of the first intrinsic topological insulator: MnBi2Te4”</w:t>
+      </w:r>
+      <w:r>
+        <w:t xml:space="preserve">, Fayetteville State University (virtual) (invited)</w:t>
+      </w:r>
+    </w:p>
+    <w:p>
+      <w:pPr>
+        <w:pStyle w:val="Compact"/>
+        <w:numPr>
+          <w:ilvl w:val="0"/>
+          <w:numId w:val="1013"/>
+        </w:numPr>
+      </w:pPr>
+      <w:r>
+        <w:t xml:space="preserve">“DPOLY Short course Machine Learning for Polymer Physicists: Neural Networks”</w:t>
+      </w:r>
+      <w:r>
+        <w:t xml:space="preserve">, March Meeting of the American Physical Society, Denver, CO</w:t>
+      </w:r>
+    </w:p>
+    <w:p>
+      <w:pPr>
+        <w:pStyle w:val="Compact"/>
+        <w:numPr>
+          <w:ilvl w:val="0"/>
+          <w:numId w:val="1013"/>
+        </w:numPr>
+      </w:pPr>
+      <w:r>
+        <w:t xml:space="preserve">“Red Cross Fire Risk”</w:t>
+      </w:r>
+      <w:r>
+        <w:t xml:space="preserve">, JSM 2020 Virtual Conference</w:t>
+      </w:r>
+    </w:p>
+    <w:p>
+      <w:pPr>
+        <w:pStyle w:val="Compact"/>
+        <w:numPr>
+          <w:ilvl w:val="0"/>
+          <w:numId w:val="1013"/>
+        </w:numPr>
+      </w:pPr>
+      <w:r>
+        <w:t xml:space="preserve">“Experimental Aspects of magnetic structure determination”</w:t>
+      </w:r>
+      <w:r>
+        <w:t xml:space="preserve">, Virtual Workshop on Magnetic Structures, Oak Ridge National Laboratory (virtual)</w:t>
+      </w:r>
+    </w:p>
+    <w:bookmarkEnd w:id="29"/>
+    <w:bookmarkStart w:id="30" w:name="section-7"/>
+    <w:p>
+      <w:pPr>
+        <w:pStyle w:val="Heading3"/>
+      </w:pPr>
+      <w:r>
+        <w:t xml:space="preserve">2019</w:t>
+      </w:r>
+    </w:p>
+    <w:p>
+      <w:pPr>
+        <w:pStyle w:val="Compact"/>
+        <w:numPr>
+          <w:ilvl w:val="0"/>
+          <w:numId w:val="1014"/>
+        </w:numPr>
+      </w:pPr>
+      <w:r>
+        <w:t xml:space="preserve">“Neutron Investigations of the Multiferroic Skyrmion GaV4S8”</w:t>
+      </w:r>
+      <w:r>
+        <w:t xml:space="preserve">, March Meeting of the American Physical Society, Boston, MA</w:t>
+      </w:r>
+    </w:p>
+    <w:p>
+      <w:pPr>
+        <w:pStyle w:val="Compact"/>
+        <w:numPr>
+          <w:ilvl w:val="0"/>
+          <w:numId w:val="1014"/>
+        </w:numPr>
+      </w:pPr>
+      <w:r>
+        <w:t xml:space="preserve">“Neutron Investigations of the Multiferroic Skyrmion GaV4S8”</w:t>
+      </w:r>
+      <w:r>
+        <w:t xml:space="preserve">, Strongly Correlated Electronic Systems Conference, Okayama, Japan</w:t>
+      </w:r>
+    </w:p>
+    <w:bookmarkEnd w:id="30"/>
+    <w:bookmarkStart w:id="31" w:name="section-8"/>
+    <w:p>
+      <w:pPr>
+        <w:pStyle w:val="Heading3"/>
+      </w:pPr>
+      <w:r>
+        <w:t xml:space="preserve">2018</w:t>
+      </w:r>
+    </w:p>
+    <w:p>
+      <w:pPr>
+        <w:pStyle w:val="Compact"/>
+        <w:numPr>
+          <w:ilvl w:val="0"/>
+          <w:numId w:val="1015"/>
+        </w:numPr>
+      </w:pPr>
+      <w:r>
+        <w:t xml:space="preserve">“Neutron Investigations of Thin Film Ho2Ti2O7”</w:t>
+      </w:r>
+      <w:r>
+        <w:t xml:space="preserve">, March Meeting of the American Physical Society, Los Angeles, CA</w:t>
+      </w:r>
+    </w:p>
+    <w:p>
+      <w:pPr>
+        <w:pStyle w:val="Compact"/>
+        <w:numPr>
+          <w:ilvl w:val="0"/>
+          <w:numId w:val="1015"/>
+        </w:numPr>
+      </w:pPr>
+      <w:r>
+        <w:t xml:space="preserve">“Mechanical control of the band structure of MoTe2”</w:t>
+      </w:r>
+      <w:r>
+        <w:t xml:space="preserve">, Telluride, Telluride, Colorado</w:t>
+      </w:r>
+    </w:p>
+    <w:p>
+      <w:pPr>
+        <w:pStyle w:val="Compact"/>
+        <w:numPr>
+          <w:ilvl w:val="0"/>
+          <w:numId w:val="1015"/>
+        </w:numPr>
+      </w:pPr>
+      <w:r>
+        <w:t xml:space="preserve">“Using neutron scattering to understand solid state materials”</w:t>
+      </w:r>
+      <w:r>
+        <w:t xml:space="preserve">, Corning Research, Sunnyvale, CA (invited)</w:t>
+      </w:r>
+    </w:p>
+    <w:p>
+      <w:pPr>
+        <w:pStyle w:val="Compact"/>
+        <w:numPr>
+          <w:ilvl w:val="0"/>
+          <w:numId w:val="1015"/>
+        </w:numPr>
+      </w:pPr>
+      <w:r>
+        <w:t xml:space="preserve">“Neutron Investigations of the Multiferroic Skyrmion GaV4S8”</w:t>
+      </w:r>
+      <w:r>
+        <w:t xml:space="preserve">, International Conference on Magnetism, San Francisco, CA</w:t>
+      </w:r>
+    </w:p>
+    <w:p>
+      <w:pPr>
+        <w:pStyle w:val="Compact"/>
+        <w:numPr>
+          <w:ilvl w:val="0"/>
+          <w:numId w:val="1015"/>
+        </w:numPr>
+      </w:pPr>
+      <w:r>
+        <w:t xml:space="preserve">“Multiferroic LuFeO3: Adventures in Neutron Scattering”</w:t>
+      </w:r>
+      <w:r>
+        <w:t xml:space="preserve">, Howard University, Department of Chemistry (invited)</w:t>
+      </w:r>
+    </w:p>
+    <w:bookmarkEnd w:id="31"/>
+    <w:bookmarkStart w:id="32" w:name="section-9"/>
+    <w:p>
+      <w:pPr>
+        <w:pStyle w:val="Heading3"/>
+      </w:pPr>
+      <w:r>
+        <w:t xml:space="preserve">2017</w:t>
+      </w:r>
+    </w:p>
+    <w:p>
+      <w:pPr>
+        <w:pStyle w:val="Compact"/>
+        <w:numPr>
+          <w:ilvl w:val="0"/>
+          <w:numId w:val="1016"/>
+        </w:numPr>
+      </w:pPr>
+      <w:r>
+        <w:t xml:space="preserve">“Effects of Electric Field on the magnetic structure of multiferroic (Sm,Bi)FeO3 films”</w:t>
+      </w:r>
+      <w:r>
+        <w:t xml:space="preserve">, March Meeting of the American Physical Society, New Orleans, LA</w:t>
+      </w:r>
+    </w:p>
+    <w:p>
+      <w:pPr>
+        <w:pStyle w:val="Compact"/>
+        <w:numPr>
+          <w:ilvl w:val="0"/>
+          <w:numId w:val="1016"/>
+        </w:numPr>
+      </w:pPr>
+      <w:r>
+        <w:t xml:space="preserve">“Magnetic structures and dynamics of multiferroic systems obtained with neutron scattering”</w:t>
+      </w:r>
+      <w:r>
+        <w:t xml:space="preserve">, Mid-Atlantic Sectional Meeting, Newark, NJ (invited)</w:t>
+      </w:r>
+    </w:p>
+    <w:p>
+      <w:pPr>
+        <w:pStyle w:val="Compact"/>
+        <w:numPr>
+          <w:ilvl w:val="0"/>
+          <w:numId w:val="1016"/>
+        </w:numPr>
+      </w:pPr>
+      <w:r>
+        <w:t xml:space="preserve">“Multiferroic h-LuFeO3–adventures in Neutron Scattering”</w:t>
+      </w:r>
+      <w:r>
+        <w:t xml:space="preserve">, Pittsburgh Diffraction Society, Indiana, PA (invited)</w:t>
+      </w:r>
+    </w:p>
+    <w:p>
+      <w:pPr>
+        <w:pStyle w:val="Compact"/>
+        <w:numPr>
+          <w:ilvl w:val="0"/>
+          <w:numId w:val="1016"/>
+        </w:numPr>
+      </w:pPr>
+      <w:r>
+        <w:t xml:space="preserve">“Neutron Investigations of thin film Ho2Ti2O7”</w:t>
+      </w:r>
+      <w:r>
+        <w:t xml:space="preserve">, Quantum Materials Symposium 2017, Berlin, Germany</w:t>
+      </w:r>
+    </w:p>
     <w:bookmarkEnd w:id="32"/>
+    <w:bookmarkStart w:id="33" w:name="section-10"/>
+    <w:p>
+      <w:pPr>
+        <w:pStyle w:val="Heading3"/>
+      </w:pPr>
+      <w:r>
+        <w:t xml:space="preserve">2016</w:t>
+      </w:r>
+    </w:p>
+    <w:p>
+      <w:pPr>
+        <w:pStyle w:val="Compact"/>
+        <w:numPr>
+          <w:ilvl w:val="0"/>
+          <w:numId w:val="1017"/>
+        </w:numPr>
+      </w:pPr>
+      <w:r>
+        <w:t xml:space="preserve">“Bayesian Library for the Analysis of Neutron Diffraction Data”</w:t>
+      </w:r>
+      <w:r>
+        <w:t xml:space="preserve">, March Meeting of the American Physical Society, Baltimore, MD</w:t>
+      </w:r>
+    </w:p>
+    <w:p>
+      <w:pPr>
+        <w:pStyle w:val="Compact"/>
+        <w:numPr>
+          <w:ilvl w:val="0"/>
+          <w:numId w:val="1017"/>
+        </w:numPr>
+      </w:pPr>
+      <w:r>
+        <w:t xml:space="preserve">“Bayesian Library for the Analysis of Neutron Diffraction Data (BLAND)”</w:t>
+      </w:r>
+      <w:r>
+        <w:t xml:space="preserve">, American Conference on Neutron Scattering</w:t>
+      </w:r>
+    </w:p>
+    <w:p>
+      <w:pPr>
+        <w:pStyle w:val="Compact"/>
+        <w:numPr>
+          <w:ilvl w:val="0"/>
+          <w:numId w:val="1017"/>
+        </w:numPr>
+      </w:pPr>
+      <w:r>
+        <w:t xml:space="preserve">“Bayesian Library for the Analysis of Neutron Diffraction Data”</w:t>
+      </w:r>
+      <w:r>
+        <w:t xml:space="preserve">, American Crystallography Association, Denver</w:t>
+      </w:r>
+    </w:p>
+    <w:p>
+      <w:pPr>
+        <w:pStyle w:val="Compact"/>
+        <w:numPr>
+          <w:ilvl w:val="0"/>
+          <w:numId w:val="1017"/>
+        </w:numPr>
+      </w:pPr>
+      <w:r>
+        <w:t xml:space="preserve">“Atomically engineered ferroic layers yield a room temperature magnetoelectric multiferroic”</w:t>
+      </w:r>
+      <w:r>
+        <w:t xml:space="preserve">, Gordon Conference on Multiferroics, Lewiston, Maine</w:t>
+      </w:r>
+    </w:p>
+    <w:p>
+      <w:pPr>
+        <w:pStyle w:val="Compact"/>
+        <w:numPr>
+          <w:ilvl w:val="0"/>
+          <w:numId w:val="1017"/>
+        </w:numPr>
+      </w:pPr>
+      <w:r>
+        <w:t xml:space="preserve">“Atomically engineered ferroic layers yield a room temperature magnetoelectric multiferroic”</w:t>
+      </w:r>
+      <w:r>
+        <w:t xml:space="preserve">, Quantum Materials Synthesis Conference, New York Academies of Science, New York</w:t>
+      </w:r>
+    </w:p>
+    <w:p>
+      <w:pPr>
+        <w:pStyle w:val="Compact"/>
+        <w:numPr>
+          <w:ilvl w:val="0"/>
+          <w:numId w:val="1017"/>
+        </w:numPr>
+      </w:pPr>
+      <w:r>
+        <w:t xml:space="preserve">Invited Lecturer, Magnetic Structure Determination from Neutron Data, Florida State University, Tallahassee, FL</w:t>
+      </w:r>
+    </w:p>
     <w:bookmarkEnd w:id="33"/>
-    <w:bookmarkStart w:id="61" w:name="selected-conference-talksposters"/>
-    <w:p>
-      <w:pPr>
-        <w:pStyle w:val="Heading2"/>
-      </w:pPr>
-      <w:r>
-        <w:t xml:space="preserve">Selected Conference Talks/Posters</w:t>
-      </w:r>
-    </w:p>
-    <w:bookmarkStart w:id="34" w:name="section"/>
+    <w:bookmarkStart w:id="34" w:name="section-11"/>
     <w:p>
       <w:pPr>
         <w:pStyle w:val="Heading3"/>
       </w:pPr>
       <w:r>
-        <w:t xml:space="preserve">2026</w:t>
-      </w:r>
-    </w:p>
-    <w:p>
-      <w:pPr>
-        <w:pStyle w:val="Compact"/>
-        <w:numPr>
-          <w:ilvl w:val="0"/>
-          <w:numId w:val="1007"/>
-        </w:numPr>
-      </w:pPr>
-      <w:r>
-        <w:t xml:space="preserve">“Crystal Communities”</w:t>
-      </w:r>
-      <w:r>
-        <w:t xml:space="preserve">, Enhanced Functionalities in 4 and 5d Containing Materials from Large Spin-Orbit Coupling Workshop, Telluride Science Research Center, Telluride, CO (invited)</w:t>
-      </w:r>
-    </w:p>
-    <w:p>
-      <w:pPr>
-        <w:pStyle w:val="Compact"/>
-        <w:numPr>
-          <w:ilvl w:val="0"/>
-          <w:numId w:val="1007"/>
-        </w:numPr>
-      </w:pPr>
-      <w:r>
-        <w:t xml:space="preserve">“Experimental Aspects of Neutron Diffraction”</w:t>
-      </w:r>
-      <w:r>
-        <w:t xml:space="preserve">, Magnetic Structure Determination from Neutron Diffraction Data (MagStr 2026), Duke University, Durham, NC (invited)</w:t>
-      </w:r>
-    </w:p>
-    <w:p>
-      <w:pPr>
-        <w:pStyle w:val="Compact"/>
-        <w:numPr>
-          <w:ilvl w:val="0"/>
-          <w:numId w:val="1007"/>
-        </w:numPr>
-      </w:pPr>
-      <w:r>
-        <w:t xml:space="preserve">“Attention Is Not All You Need for Diffraction”</w:t>
-      </w:r>
-      <w:r>
-        <w:t xml:space="preserve">, 13th American Conference on Neutron Scattering (ACNS 2026), Detroit Marriott at the Renaissance Center, Detroit, MI (invited)</w:t>
-      </w:r>
-    </w:p>
-    <w:p>
-      <w:pPr>
-        <w:pStyle w:val="Compact"/>
-        <w:numPr>
-          <w:ilvl w:val="0"/>
-          <w:numId w:val="1007"/>
-        </w:numPr>
-      </w:pPr>
-      <w:r>
-        <w:t xml:space="preserve">“Attention Is Not All You Need for Diffraction”</w:t>
-      </w:r>
-      <w:r>
-        <w:t xml:space="preserve">, Machine Learning for X-ray and Neutron Science (MLXN) 2026, AGU Conference Center, Washington, DC (invited)</w:t>
-      </w:r>
-    </w:p>
-    <w:p>
-      <w:pPr>
-        <w:pStyle w:val="Compact"/>
-        <w:numPr>
-          <w:ilvl w:val="0"/>
-          <w:numId w:val="1007"/>
-        </w:numPr>
-      </w:pPr>
-      <w:r>
-        <w:t xml:space="preserve">“Attention Is Not All You Need for Diffraction”</w:t>
-      </w:r>
-      <w:r>
-        <w:t xml:space="preserve">, Artificial Intelligence for Materials Science (AIMS) 2026, NIST, Gaithersburg, MD (invited)</w:t>
-      </w:r>
-    </w:p>
-    <w:p>
-      <w:pPr>
-        <w:pStyle w:val="Compact"/>
-        <w:numPr>
-          <w:ilvl w:val="0"/>
-          <w:numId w:val="1007"/>
-        </w:numPr>
-      </w:pPr>
-      <w:r>
-        <w:t xml:space="preserve">“Attention is Not All You Need: For Diffraction”</w:t>
-      </w:r>
-      <w:r>
-        <w:t xml:space="preserve">, Frontiers of AI-Realized Metastable Materials Workshop, National Academies of Sciences, Engineering, and Medicine (Condensed Matter and Materials Research Committee), Keck Center, Washington, DC (invited)</w:t>
-      </w:r>
-    </w:p>
-    <w:p>
-      <w:pPr>
-        <w:pStyle w:val="Compact"/>
-        <w:numPr>
-          <w:ilvl w:val="0"/>
-          <w:numId w:val="1007"/>
-        </w:numPr>
-      </w:pPr>
-      <w:r>
-        <w:t xml:space="preserve">“AI and Neutron Scattering”</w:t>
-      </w:r>
-      <w:r>
-        <w:t xml:space="preserve">, Gordon Research Conference on Multifunctional Materials and Structures: Enabling Multifunctionality through AI Informed Material Discovery and System Design, Ventura, CA (invited)</w:t>
-      </w:r>
-    </w:p>
-    <w:p>
-      <w:pPr>
-        <w:pStyle w:val="Compact"/>
-        <w:numPr>
-          <w:ilvl w:val="0"/>
-          <w:numId w:val="1007"/>
-        </w:numPr>
-      </w:pPr>
-      <w:r>
-        <w:t xml:space="preserve">“Introduction to Neural Networks”</w:t>
-      </w:r>
-      <w:r>
-        <w:t xml:space="preserve">, Short Course: Data Science for Physicists I, APS Global Physics Summit, Denver, CO (invited)</w:t>
-      </w:r>
-    </w:p>
-    <w:p>
-      <w:pPr>
-        <w:pStyle w:val="Compact"/>
-        <w:numPr>
-          <w:ilvl w:val="0"/>
-          <w:numId w:val="1007"/>
-        </w:numPr>
-      </w:pPr>
-      <w:r>
-        <w:t xml:space="preserve">“AI and Neutron Scattering”</w:t>
-      </w:r>
-      <w:r>
-        <w:t xml:space="preserve">, Department of Physics, George Mason University (April 2026) (invited)</w:t>
-      </w:r>
-    </w:p>
-    <w:p>
-      <w:pPr>
-        <w:pStyle w:val="Compact"/>
-        <w:numPr>
-          <w:ilvl w:val="0"/>
-          <w:numId w:val="1007"/>
-        </w:numPr>
-      </w:pPr>
-      <w:r>
-        <w:t xml:space="preserve">“Attention is not all you need: Comparing the performance of transformers and CNNs in classifying space groups from powder diffraction data”</w:t>
-      </w:r>
-      <w:r>
-        <w:t xml:space="preserve">, APS Global Physics Summit, Denver, CO</w:t>
+        <w:t xml:space="preserve">2015</w:t>
+      </w:r>
+    </w:p>
+    <w:p>
+      <w:pPr>
+        <w:pStyle w:val="Compact"/>
+        <w:numPr>
+          <w:ilvl w:val="0"/>
+          <w:numId w:val="1018"/>
+        </w:numPr>
+      </w:pPr>
+      <w:r>
+        <w:t xml:space="preserve">“Neutron scattering investigations of bulk and thin film multiferroic LuFeO3”</w:t>
+      </w:r>
+      <w:r>
+        <w:t xml:space="preserve">, International Conference on Magnetism, Barcelona, Spain</w:t>
+      </w:r>
+    </w:p>
+    <w:p>
+      <w:pPr>
+        <w:pStyle w:val="Compact"/>
+        <w:numPr>
+          <w:ilvl w:val="0"/>
+          <w:numId w:val="1018"/>
+        </w:numPr>
+      </w:pPr>
+      <w:r>
+        <w:t xml:space="preserve">“Neutron investigations of multiferroic LuFeO3”</w:t>
+      </w:r>
+      <w:r>
+        <w:t xml:space="preserve">, American Crystallography Association, Philadelphia</w:t>
+      </w:r>
+    </w:p>
+    <w:p>
+      <w:pPr>
+        <w:pStyle w:val="Compact"/>
+        <w:numPr>
+          <w:ilvl w:val="0"/>
+          <w:numId w:val="1018"/>
+        </w:numPr>
+      </w:pPr>
+      <w:r>
+        <w:t xml:space="preserve">“The intrinsic magnetic structure and ordering of multiferroic h-LuFeO3 Films”</w:t>
+      </w:r>
+      <w:r>
+        <w:t xml:space="preserve">, March Meeting of the American Physical Society, San Antonio, TX</w:t>
       </w:r>
     </w:p>
     <w:bookmarkEnd w:id="34"/>
-    <w:bookmarkStart w:id="35" w:name="section-1"/>
+    <w:bookmarkStart w:id="35" w:name="section-12"/>
     <w:p>
       <w:pPr>
         <w:pStyle w:val="Heading3"/>
       </w:pPr>
       <w:r>
-        <w:t xml:space="preserve">2025</w:t>
-      </w:r>
-    </w:p>
-    <w:p>
-      <w:pPr>
-        <w:pStyle w:val="Compact"/>
-        <w:numPr>
-          <w:ilvl w:val="0"/>
-          <w:numId w:val="1008"/>
-        </w:numPr>
-      </w:pPr>
-      <w:r>
-        <w:t xml:space="preserve">“Single Crystal Diffraction”</w:t>
-      </w:r>
-      <w:r>
-        <w:t xml:space="preserve">, 1st Neutron Scattering School (invited)</w:t>
-      </w:r>
-    </w:p>
-    <w:p>
-      <w:pPr>
-        <w:pStyle w:val="Compact"/>
-        <w:numPr>
-          <w:ilvl w:val="0"/>
-          <w:numId w:val="1008"/>
-        </w:numPr>
-      </w:pPr>
-      <w:r>
-        <w:t xml:space="preserve">“Accelerating Materials Discovery: The Role of AI in Neutron Scattering Research”</w:t>
-      </w:r>
-      <w:r>
-        <w:t xml:space="preserve">, American Physical Society Global Physics Summit, Anaheim, CA (invited)</w:t>
-      </w:r>
-    </w:p>
-    <w:p>
-      <w:pPr>
-        <w:pStyle w:val="Compact"/>
-        <w:numPr>
-          <w:ilvl w:val="0"/>
-          <w:numId w:val="1008"/>
-        </w:numPr>
-      </w:pPr>
-      <w:r>
-        <w:t xml:space="preserve">“Neural Networks for Physicists”</w:t>
-      </w:r>
-      <w:r>
-        <w:t xml:space="preserve">, Data Science for Physicists Short Course, American Physical Society Global Physics Summit, Anaheim, CA (invited)</w:t>
-      </w:r>
-    </w:p>
-    <w:p>
-      <w:pPr>
-        <w:pStyle w:val="Compact"/>
-        <w:numPr>
-          <w:ilvl w:val="0"/>
-          <w:numId w:val="1008"/>
-        </w:numPr>
-      </w:pPr>
-      <w:r>
-        <w:t xml:space="preserve">“Applications of Artificial Intelligence to Neutron Scattering”</w:t>
-      </w:r>
-      <w:r>
-        <w:t xml:space="preserve">, Department of Physics, James Madison University (invited)</w:t>
-      </w:r>
-    </w:p>
-    <w:p>
-      <w:pPr>
-        <w:pStyle w:val="Compact"/>
-        <w:numPr>
-          <w:ilvl w:val="0"/>
-          <w:numId w:val="1008"/>
-        </w:numPr>
-      </w:pPr>
-      <w:r>
-        <w:t xml:space="preserve">“Applications of Artificial Intelligence to Neutron Scattering”</w:t>
-      </w:r>
-      <w:r>
-        <w:t xml:space="preserve">, Department of Physics, University of Buffalo (invited)</w:t>
-      </w:r>
-    </w:p>
-    <w:p>
-      <w:pPr>
-        <w:pStyle w:val="Compact"/>
-        <w:numPr>
-          <w:ilvl w:val="0"/>
-          <w:numId w:val="1008"/>
-        </w:numPr>
-      </w:pPr>
-      <w:r>
-        <w:t xml:space="preserve">“Applications of Artificial Intelligence to Neutron Scattering”</w:t>
-      </w:r>
-      <w:r>
-        <w:t xml:space="preserve">, Georgetown Data Science and Analytics Program (invited)</w:t>
+        <w:t xml:space="preserve">2014</w:t>
+      </w:r>
+    </w:p>
+    <w:p>
+      <w:pPr>
+        <w:pStyle w:val="Compact"/>
+        <w:numPr>
+          <w:ilvl w:val="0"/>
+          <w:numId w:val="1019"/>
+        </w:numPr>
+      </w:pPr>
+      <w:r>
+        <w:t xml:space="preserve">“Neutron Investigations of Multiferroic LuFeO3”</w:t>
+      </w:r>
+      <w:r>
+        <w:t xml:space="preserve">, Gordon Research Conference, Biddeford, ME</w:t>
+      </w:r>
+    </w:p>
+    <w:p>
+      <w:pPr>
+        <w:pStyle w:val="Compact"/>
+        <w:numPr>
+          <w:ilvl w:val="0"/>
+          <w:numId w:val="1019"/>
+        </w:numPr>
+      </w:pPr>
+      <w:r>
+        <w:t xml:space="preserve">“Neutron diffraction investigations of BiFeO3”</w:t>
+      </w:r>
+      <w:r>
+        <w:t xml:space="preserve">, Polarized Neutrons for Condensed Matter Investigations, U. Sydney, Sydney, Australia (invited)</w:t>
+      </w:r>
+    </w:p>
+    <w:p>
+      <w:pPr>
+        <w:pStyle w:val="Compact"/>
+        <w:numPr>
+          <w:ilvl w:val="0"/>
+          <w:numId w:val="1019"/>
+        </w:numPr>
+      </w:pPr>
+      <w:r>
+        <w:t xml:space="preserve">Invited Lecturer, Magnetic Structure Determination from Neutron Data, Oak Ridge National Lab, Knoxville, TN</w:t>
+      </w:r>
+    </w:p>
+    <w:p>
+      <w:pPr>
+        <w:pStyle w:val="Compact"/>
+        <w:numPr>
+          <w:ilvl w:val="0"/>
+          <w:numId w:val="1019"/>
+        </w:numPr>
+      </w:pPr>
+      <w:r>
+        <w:t xml:space="preserve">“Neutron Investigations of Multiferroic LuFeO3 Thin Films”</w:t>
+      </w:r>
+      <w:r>
+        <w:t xml:space="preserve">, American Conference on Neutron Scattering, Knoxville, TN</w:t>
+      </w:r>
+    </w:p>
+    <w:p>
+      <w:pPr>
+        <w:pStyle w:val="Compact"/>
+        <w:numPr>
+          <w:ilvl w:val="0"/>
+          <w:numId w:val="1019"/>
+        </w:numPr>
+      </w:pPr>
+      <w:r>
+        <w:t xml:space="preserve">“Neutron Investigations of Multiferroic LuFe1-xMnxO3”</w:t>
+      </w:r>
+      <w:r>
+        <w:t xml:space="preserve">, March Meeting of the American Physical Society, Denver</w:t>
+      </w:r>
+    </w:p>
+    <w:p>
+      <w:pPr>
+        <w:pStyle w:val="Compact"/>
+        <w:numPr>
+          <w:ilvl w:val="0"/>
+          <w:numId w:val="1019"/>
+        </w:numPr>
+      </w:pPr>
+      <w:r>
+        <w:t xml:space="preserve">“Neutron Investigations of Multiferroic LuFe1-xMnxO3”</w:t>
+      </w:r>
+      <w:r>
+        <w:t xml:space="preserve">, Magnetic North IV, Victoria, British Columbia, Canada</w:t>
       </w:r>
     </w:p>
     <w:bookmarkEnd w:id="35"/>
-    <w:bookmarkStart w:id="36" w:name="section-2"/>
+    <w:bookmarkStart w:id="36" w:name="section-13"/>
     <w:p>
       <w:pPr>
         <w:pStyle w:val="Heading3"/>
       </w:pPr>
       <w:r>
-        <w:t xml:space="preserve">2024</w:t>
-      </w:r>
-    </w:p>
-    <w:p>
-      <w:pPr>
-        <w:pStyle w:val="Compact"/>
-        <w:numPr>
-          <w:ilvl w:val="0"/>
-          <w:numId w:val="1009"/>
-        </w:numPr>
-      </w:pPr>
-      <w:r>
-        <w:t xml:space="preserve">“Single Crystal Diffraction”</w:t>
-      </w:r>
-      <w:r>
-        <w:t xml:space="preserve">, Neutron X-Ray School (invited)</w:t>
-      </w:r>
-    </w:p>
-    <w:p>
-      <w:pPr>
-        <w:pStyle w:val="Compact"/>
-        <w:numPr>
-          <w:ilvl w:val="0"/>
-          <w:numId w:val="1009"/>
-        </w:numPr>
-      </w:pPr>
-      <w:r>
-        <w:t xml:space="preserve">“Applications of Artificial Intelligence to Neutron Scattering”</w:t>
-      </w:r>
-      <w:r>
-        <w:t xml:space="preserve">, Department of Physics, Johns Hopkins (invited)</w:t>
-      </w:r>
-    </w:p>
-    <w:p>
-      <w:pPr>
-        <w:pStyle w:val="Compact"/>
-        <w:numPr>
-          <w:ilvl w:val="0"/>
-          <w:numId w:val="1009"/>
-        </w:numPr>
-      </w:pPr>
-      <w:r>
-        <w:t xml:space="preserve">“Experimental Aspects of magnetic structure determination”</w:t>
-      </w:r>
-      <w:r>
-        <w:t xml:space="preserve">, Magnetic Structure School, Kennesaw State University (invited)</w:t>
-      </w:r>
-    </w:p>
-    <w:p>
-      <w:pPr>
-        <w:pStyle w:val="Compact"/>
-        <w:numPr>
-          <w:ilvl w:val="0"/>
-          <w:numId w:val="1009"/>
-        </w:numPr>
-      </w:pPr>
-      <w:r>
-        <w:t xml:space="preserve">“Incorporating Data Science in the Undergraduate Physics Curriculum”</w:t>
-      </w:r>
-      <w:r>
-        <w:t xml:space="preserve">, March Meeting of the American Physical Society (invited)</w:t>
-      </w:r>
-    </w:p>
-    <w:p>
-      <w:pPr>
-        <w:pStyle w:val="Compact"/>
-        <w:numPr>
-          <w:ilvl w:val="0"/>
-          <w:numId w:val="1009"/>
-        </w:numPr>
-      </w:pPr>
-      <w:r>
-        <w:t xml:space="preserve">“Unsupervised Learning for Physicists”</w:t>
-      </w:r>
-      <w:r>
-        <w:t xml:space="preserve">, Data Science for Physicists Tutorial, American Physical Society Global Physics Summit (invited)</w:t>
-      </w:r>
-    </w:p>
-    <w:p>
-      <w:pPr>
-        <w:pStyle w:val="Compact"/>
-        <w:numPr>
-          <w:ilvl w:val="0"/>
-          <w:numId w:val="1009"/>
-        </w:numPr>
-      </w:pPr>
-      <w:r>
-        <w:t xml:space="preserve">“Mapping the ICSD”</w:t>
+        <w:t xml:space="preserve">2013</w:t>
+      </w:r>
+    </w:p>
+    <w:p>
+      <w:pPr>
+        <w:pStyle w:val="Compact"/>
+        <w:numPr>
+          <w:ilvl w:val="0"/>
+          <w:numId w:val="1020"/>
+        </w:numPr>
+      </w:pPr>
+      <w:r>
+        <w:t xml:space="preserve">“Evolution of the magnetic structure in (Sm,Bi)FeO3 Thin Films”</w:t>
+      </w:r>
+      <w:r>
+        <w:t xml:space="preserve">, March Meeting of the American Physical Society, Baltimore</w:t>
+      </w:r>
+    </w:p>
+    <w:p>
+      <w:pPr>
+        <w:pStyle w:val="Compact"/>
+        <w:numPr>
+          <w:ilvl w:val="0"/>
+          <w:numId w:val="1020"/>
+        </w:numPr>
+      </w:pPr>
+      <w:r>
+        <w:t xml:space="preserve">“Neutron Investigations of Multiferroic LuFeO3”</w:t>
+      </w:r>
+      <w:r>
+        <w:t xml:space="preserve">, Magnetism and Magnetic Materials, Denver, CO</w:t>
+      </w:r>
+    </w:p>
+    <w:p>
+      <w:pPr>
+        <w:pStyle w:val="Compact"/>
+        <w:numPr>
+          <w:ilvl w:val="0"/>
+          <w:numId w:val="1020"/>
+        </w:numPr>
+      </w:pPr>
+      <w:r>
+        <w:t xml:space="preserve">“Neutron Diffraction Investigations of Electric-Field Control of Antiferromagnetic Domains in Epitaxial BiFeO3 Thin Films”</w:t>
+      </w:r>
+      <w:r>
+        <w:t xml:space="preserve">, Fundamental Physics of Ferroelectrics and Related Materials, Ames, IA</w:t>
+      </w:r>
+    </w:p>
+    <w:bookmarkEnd w:id="36"/>
+    <w:bookmarkStart w:id="37" w:name="section-14"/>
+    <w:p>
+      <w:pPr>
+        <w:pStyle w:val="Heading3"/>
+      </w:pPr>
+      <w:r>
+        <w:t xml:space="preserve">2012</w:t>
+      </w:r>
+    </w:p>
+    <w:p>
+      <w:pPr>
+        <w:pStyle w:val="Compact"/>
+        <w:numPr>
+          <w:ilvl w:val="0"/>
+          <w:numId w:val="1021"/>
+        </w:numPr>
+      </w:pPr>
+      <w:r>
+        <w:t xml:space="preserve">Invited Lecturer, Magnetic Structure Determination from Neutron Data, Oak Ridge National Lab, Oak Ridge, TN</w:t>
+      </w:r>
+    </w:p>
+    <w:p>
+      <w:pPr>
+        <w:pStyle w:val="Compact"/>
+        <w:numPr>
+          <w:ilvl w:val="0"/>
+          <w:numId w:val="1021"/>
+        </w:numPr>
+      </w:pPr>
+      <w:r>
+        <w:t xml:space="preserve">“Neutron Diffraction Investigations of Magnetism in BiFeO3 Epitaxial Films”</w:t>
+      </w:r>
+      <w:r>
+        <w:t xml:space="preserve">, American Conference on Neutron Scattering (invited)</w:t>
+      </w:r>
+    </w:p>
+    <w:p>
+      <w:pPr>
+        <w:pStyle w:val="Compact"/>
+        <w:numPr>
+          <w:ilvl w:val="0"/>
+          <w:numId w:val="1021"/>
+        </w:numPr>
+      </w:pPr>
+      <w:r>
+        <w:t xml:space="preserve">“Investigation of Electric Field Control Antiferromagnetic Domains in Epitaxial BiFeO3 Thin Films Using Neutron Diffraction”</w:t>
       </w:r>
       <w:r>
         <w:t xml:space="preserve">, March Meeting of the American Physical Society</w:t>
@@ -6071,1622 +7203,503 @@
         <w:pStyle w:val="Compact"/>
         <w:numPr>
           <w:ilvl w:val="0"/>
-          <w:numId w:val="1009"/>
-        </w:numPr>
-      </w:pPr>
-      <w:r>
-        <w:t xml:space="preserve">“Neutron Scattering and AI”</w:t>
-      </w:r>
-      <w:r>
-        <w:t xml:space="preserve"> </w:t>
-      </w:r>
-      <w:r>
-        <w:t xml:space="preserve">(and panel), Neutron PI meeting, Rockville, MD (invited)</w:t>
-      </w:r>
-    </w:p>
-    <w:p>
-      <w:pPr>
-        <w:pStyle w:val="Compact"/>
-        <w:numPr>
-          <w:ilvl w:val="0"/>
-          <w:numId w:val="1009"/>
-        </w:numPr>
-      </w:pPr>
-      <w:r>
-        <w:t xml:space="preserve">“Semi and Self Supervised approaches to Space Group and Bravais Lattice Determination”</w:t>
-      </w:r>
-      <w:r>
-        <w:t xml:space="preserve">, Electronic Materials and Applications 2024, Denver, CO (invited)</w:t>
-      </w:r>
-    </w:p>
-    <w:p>
-      <w:pPr>
-        <w:pStyle w:val="Compact"/>
-        <w:numPr>
-          <w:ilvl w:val="0"/>
-          <w:numId w:val="1009"/>
-        </w:numPr>
-      </w:pPr>
-      <w:r>
-        <w:t xml:space="preserve">“Quantum Materials at NIST”</w:t>
-      </w:r>
-      <w:r>
-        <w:t xml:space="preserve">, Quantum Noir, Harvard University (invited)</w:t>
-      </w:r>
-    </w:p>
-    <w:p>
-      <w:pPr>
-        <w:pStyle w:val="Compact"/>
-        <w:numPr>
-          <w:ilvl w:val="0"/>
-          <w:numId w:val="1009"/>
-        </w:numPr>
-      </w:pPr>
-      <w:r>
-        <w:t xml:space="preserve">“Applications of Artificial Intelligence to Neutron Scattering”</w:t>
-      </w:r>
-      <w:r>
-        <w:t xml:space="preserve">, Department of Physics, Georgetown University (invited)</w:t>
-      </w:r>
-    </w:p>
-    <w:p>
-      <w:pPr>
-        <w:pStyle w:val="Compact"/>
-        <w:numPr>
-          <w:ilvl w:val="0"/>
-          <w:numId w:val="1009"/>
-        </w:numPr>
-      </w:pPr>
-      <w:r>
-        <w:t xml:space="preserve">“Semi and Self Supervised approaches to Space Group and Bravais Lattice Determination”</w:t>
-      </w:r>
-      <w:r>
-        <w:t xml:space="preserve">, Machine Learning Conference for X-Ray and Neutron-Based Experiments, FRM2, Garching, Germany</w:t>
-      </w:r>
-    </w:p>
-    <w:p>
-      <w:pPr>
-        <w:pStyle w:val="Compact"/>
-        <w:numPr>
-          <w:ilvl w:val="0"/>
-          <w:numId w:val="1009"/>
-        </w:numPr>
-      </w:pPr>
-      <w:r>
-        <w:t xml:space="preserve">“Applications of Artificial Intelligence to Neutron Scattering”</w:t>
-      </w:r>
-      <w:r>
-        <w:t xml:space="preserve">, Bakar Institute of Digital Materials for the Planet, Berkeley (invited)</w:t>
-      </w:r>
-    </w:p>
-    <w:p>
-      <w:pPr>
-        <w:pStyle w:val="Compact"/>
-        <w:numPr>
-          <w:ilvl w:val="0"/>
-          <w:numId w:val="1009"/>
-        </w:numPr>
-      </w:pPr>
-      <w:r>
-        <w:t xml:space="preserve">“Applications of Artificial Intelligence to Neutron Scattering”</w:t>
-      </w:r>
-      <w:r>
-        <w:t xml:space="preserve">, Department of Physics, University of Illinois (invited)</w:t>
-      </w:r>
-    </w:p>
-    <w:p>
-      <w:pPr>
-        <w:pStyle w:val="Compact"/>
-        <w:numPr>
-          <w:ilvl w:val="0"/>
-          <w:numId w:val="1009"/>
-        </w:numPr>
-      </w:pPr>
-      <w:r>
-        <w:t xml:space="preserve">“Adventures in Kagome Flat Band, ErMn6Sn6”</w:t>
-      </w:r>
-      <w:r>
-        <w:t xml:space="preserve">, Telluride Workshop, Telluride, CO (invited)</w:t>
-      </w:r>
-    </w:p>
-    <w:p>
-      <w:pPr>
-        <w:pStyle w:val="Compact"/>
-        <w:numPr>
-          <w:ilvl w:val="0"/>
-          <w:numId w:val="1009"/>
-        </w:numPr>
-      </w:pPr>
-      <w:r>
-        <w:t xml:space="preserve">“Applications of AI to crystal structure determination from powder diffraction data”</w:t>
-      </w:r>
-      <w:r>
-        <w:t xml:space="preserve">, European Crystallography Meeting/European Powder Diffraction meeting, Padova, Italy</w:t>
-      </w:r>
-    </w:p>
-    <w:bookmarkEnd w:id="36"/>
-    <w:bookmarkStart w:id="37" w:name="section-3"/>
+          <w:numId w:val="1021"/>
+        </w:numPr>
+      </w:pPr>
+      <w:r>
+        <w:t xml:space="preserve">“Neutron Diffraction Investigations of Magnetism in BiFeO3 Epitaxial Films”</w:t>
+      </w:r>
+      <w:r>
+        <w:t xml:space="preserve">, DAE Solid State Physics Symposium, IIT Bombay (invited)</w:t>
+      </w:r>
+    </w:p>
+    <w:bookmarkEnd w:id="37"/>
+    <w:bookmarkStart w:id="38" w:name="section-15"/>
     <w:p>
       <w:pPr>
         <w:pStyle w:val="Heading3"/>
       </w:pPr>
       <w:r>
-        <w:t xml:space="preserve">2023</w:t>
-      </w:r>
-    </w:p>
-    <w:p>
-      <w:pPr>
-        <w:pStyle w:val="Compact"/>
-        <w:numPr>
-          <w:ilvl w:val="0"/>
-          <w:numId w:val="1010"/>
-        </w:numPr>
-      </w:pPr>
-      <w:r>
-        <w:t xml:space="preserve">“Integrating Data Science Into the Undergraduate Physics Curriculum”</w:t>
-      </w:r>
-      <w:r>
-        <w:t xml:space="preserve">, National Society of Black Physicists, Knoxville, TN</w:t>
-      </w:r>
-    </w:p>
-    <w:p>
-      <w:pPr>
-        <w:pStyle w:val="Compact"/>
-        <w:numPr>
-          <w:ilvl w:val="0"/>
-          <w:numId w:val="1010"/>
-        </w:numPr>
-      </w:pPr>
-      <w:r>
-        <w:t xml:space="preserve">“Semi and Self Supervised approaches to Space Group and Bravais Lattice Determination”</w:t>
-      </w:r>
-      <w:r>
-        <w:t xml:space="preserve">, Pittsburgh Diffraction Society, Pittsburgh (invited)</w:t>
-      </w:r>
-    </w:p>
-    <w:p>
-      <w:pPr>
-        <w:pStyle w:val="Compact"/>
-        <w:numPr>
-          <w:ilvl w:val="0"/>
-          <w:numId w:val="1010"/>
-        </w:numPr>
-      </w:pPr>
-      <w:r>
-        <w:t xml:space="preserve">“Semi and Self Supervised approaches to Space Group and Bravais Lattice Determination”</w:t>
-      </w:r>
-      <w:r>
-        <w:t xml:space="preserve">, March meeting of the American Physical Society, Las Vegas</w:t>
-      </w:r>
-    </w:p>
-    <w:p>
-      <w:pPr>
-        <w:pStyle w:val="Compact"/>
-        <w:numPr>
-          <w:ilvl w:val="0"/>
-          <w:numId w:val="1010"/>
-        </w:numPr>
-      </w:pPr>
-      <w:r>
-        <w:t xml:space="preserve">“Applications of Artificial Intelligence to Neutron Scattering”</w:t>
-      </w:r>
-      <w:r>
-        <w:t xml:space="preserve">, Department of Physics, North Carolina A&amp;T (invited)</w:t>
-      </w:r>
-    </w:p>
-    <w:p>
-      <w:pPr>
-        <w:pStyle w:val="Compact"/>
-        <w:numPr>
-          <w:ilvl w:val="0"/>
-          <w:numId w:val="1010"/>
-        </w:numPr>
-      </w:pPr>
-      <w:r>
-        <w:t xml:space="preserve">“Semi and Self Supervised approaches to Space Group and Bravais Lattice Determination”</w:t>
-      </w:r>
-      <w:r>
-        <w:t xml:space="preserve">, International Union of Crystallography, Melbourne, Australia</w:t>
-      </w:r>
-    </w:p>
-    <w:p>
-      <w:pPr>
-        <w:pStyle w:val="Compact"/>
-        <w:numPr>
-          <w:ilvl w:val="0"/>
-          <w:numId w:val="1010"/>
-        </w:numPr>
-      </w:pPr>
-      <w:r>
-        <w:t xml:space="preserve">“Semi and Self Supervised approaches to Space Group and Bravais Lattice Determination”</w:t>
-      </w:r>
-      <w:r>
-        <w:t xml:space="preserve">, American Chemical Society, San Francisco (invited)</w:t>
-      </w:r>
-    </w:p>
-    <w:p>
-      <w:pPr>
-        <w:pStyle w:val="Compact"/>
-        <w:numPr>
-          <w:ilvl w:val="0"/>
-          <w:numId w:val="1010"/>
-        </w:numPr>
-      </w:pPr>
-      <w:r>
-        <w:t xml:space="preserve">“Semi and Self Supervised approaches to Space Group and Bravais Lattice Determination”</w:t>
-      </w:r>
-      <w:r>
-        <w:t xml:space="preserve">, Strongly Correlated Electronic Systems, Incheon, Korea (invited)</w:t>
-      </w:r>
-    </w:p>
-    <w:p>
-      <w:pPr>
-        <w:pStyle w:val="Compact"/>
-        <w:numPr>
-          <w:ilvl w:val="0"/>
-          <w:numId w:val="1010"/>
-        </w:numPr>
-      </w:pPr>
-      <w:r>
-        <w:t xml:space="preserve">“Semi and Self Supervised approaches to Space Group and Bravais Lattice Determination”</w:t>
-      </w:r>
-      <w:r>
-        <w:t xml:space="preserve">, American Crystallography Association, Baltimore</w:t>
-      </w:r>
-    </w:p>
-    <w:p>
-      <w:pPr>
-        <w:pStyle w:val="Compact"/>
-        <w:numPr>
-          <w:ilvl w:val="0"/>
-          <w:numId w:val="1010"/>
-        </w:numPr>
-      </w:pPr>
-      <w:r>
-        <w:t xml:space="preserve">“Single Crystal Diffraction”</w:t>
-      </w:r>
-      <w:r>
-        <w:t xml:space="preserve">, Neutron X-Ray School (invited)</w:t>
-      </w:r>
-    </w:p>
-    <w:p>
-      <w:pPr>
-        <w:pStyle w:val="Compact"/>
-        <w:numPr>
-          <w:ilvl w:val="0"/>
-          <w:numId w:val="1010"/>
-        </w:numPr>
-      </w:pPr>
-      <w:r>
-        <w:t xml:space="preserve">“DEI Panel: Fermilab Collaboration”</w:t>
-      </w:r>
-      <w:r>
-        <w:t xml:space="preserve"> </w:t>
-      </w:r>
-      <w:r>
-        <w:t xml:space="preserve">Virtual</w:t>
-      </w:r>
-    </w:p>
-    <w:p>
-      <w:pPr>
-        <w:pStyle w:val="Compact"/>
-        <w:numPr>
-          <w:ilvl w:val="0"/>
-          <w:numId w:val="1010"/>
-        </w:numPr>
-      </w:pPr>
-      <w:r>
-        <w:t xml:space="preserve">“Panelist: The Evolution of Data Science Conference”</w:t>
-      </w:r>
-      <w:r>
-        <w:t xml:space="preserve">, Georgetown</w:t>
-      </w:r>
-    </w:p>
-    <w:bookmarkEnd w:id="37"/>
-    <w:bookmarkStart w:id="38" w:name="section-4"/>
+        <w:t xml:space="preserve">2011</w:t>
+      </w:r>
+    </w:p>
+    <w:p>
+      <w:pPr>
+        <w:pStyle w:val="Compact"/>
+        <w:numPr>
+          <w:ilvl w:val="0"/>
+          <w:numId w:val="1022"/>
+        </w:numPr>
+      </w:pPr>
+      <w:r>
+        <w:t xml:space="preserve">“Neutron Diffraction Investigations of Magnetism in BiFeO3 Epitaxial Films”</w:t>
+      </w:r>
+      <w:r>
+        <w:t xml:space="preserve">, MMM 2011, Desert Ridge, Arizona (invited)</w:t>
+      </w:r>
+    </w:p>
+    <w:p>
+      <w:pPr>
+        <w:pStyle w:val="Compact"/>
+        <w:numPr>
+          <w:ilvl w:val="0"/>
+          <w:numId w:val="1022"/>
+        </w:numPr>
+      </w:pPr>
+      <w:r>
+        <w:t xml:space="preserve">“Neutron diffraction investigations of the BiFeO3 thin films”</w:t>
+      </w:r>
+      <w:r>
+        <w:t xml:space="preserve">, European Spallation Source, Lund, Sweden (invited)</w:t>
+      </w:r>
+    </w:p>
+    <w:p>
+      <w:pPr>
+        <w:pStyle w:val="Compact"/>
+        <w:numPr>
+          <w:ilvl w:val="0"/>
+          <w:numId w:val="1022"/>
+        </w:numPr>
+      </w:pPr>
+      <w:r>
+        <w:t xml:space="preserve">“The Renaissance of Multiferroics”</w:t>
+      </w:r>
+      <w:r>
+        <w:t xml:space="preserve">, Missouri University Science Technology (invited)</w:t>
+      </w:r>
+    </w:p>
+    <w:p>
+      <w:pPr>
+        <w:pStyle w:val="Compact"/>
+        <w:numPr>
+          <w:ilvl w:val="0"/>
+          <w:numId w:val="1022"/>
+        </w:numPr>
+      </w:pPr>
+      <w:r>
+        <w:t xml:space="preserve">“The Renaissance of Multiferroics”</w:t>
+      </w:r>
+      <w:r>
+        <w:t xml:space="preserve">, Howard University (invited)</w:t>
+      </w:r>
+    </w:p>
+    <w:p>
+      <w:pPr>
+        <w:pStyle w:val="Compact"/>
+        <w:numPr>
+          <w:ilvl w:val="0"/>
+          <w:numId w:val="1022"/>
+        </w:numPr>
+      </w:pPr>
+      <w:r>
+        <w:t xml:space="preserve">“The Magnetic Form factor of SrFe2As2”</w:t>
+      </w:r>
+      <w:r>
+        <w:t xml:space="preserve">, March Meeting of the American Physical Society, Dallas, Texas</w:t>
+      </w:r>
+    </w:p>
+    <w:bookmarkEnd w:id="38"/>
+    <w:bookmarkStart w:id="39" w:name="section-16"/>
     <w:p>
       <w:pPr>
         <w:pStyle w:val="Heading3"/>
       </w:pPr>
       <w:r>
-        <w:t xml:space="preserve">2022</w:t>
-      </w:r>
-    </w:p>
-    <w:p>
-      <w:pPr>
-        <w:pStyle w:val="Compact"/>
-        <w:numPr>
-          <w:ilvl w:val="0"/>
-          <w:numId w:val="1011"/>
-        </w:numPr>
-      </w:pPr>
-      <w:r>
-        <w:t xml:space="preserve">“Applications of Artificial Intelligence to Neutron Scattering”</w:t>
-      </w:r>
-      <w:r>
-        <w:t xml:space="preserve">, Department of Physics, University of Connecticut (invited)</w:t>
-      </w:r>
-    </w:p>
-    <w:p>
-      <w:pPr>
-        <w:pStyle w:val="Compact"/>
-        <w:numPr>
-          <w:ilvl w:val="0"/>
-          <w:numId w:val="1011"/>
-        </w:numPr>
-      </w:pPr>
-      <w:r>
-        <w:t xml:space="preserve">“Neutron Investigations of Mn(Bi,Sb)2Te4”</w:t>
-      </w:r>
-      <w:r>
-        <w:t xml:space="preserve">, MRS Meeting, Honolulu</w:t>
-      </w:r>
-    </w:p>
-    <w:p>
-      <w:pPr>
-        <w:pStyle w:val="Compact"/>
-        <w:numPr>
-          <w:ilvl w:val="0"/>
-          <w:numId w:val="1011"/>
-        </w:numPr>
-      </w:pPr>
-      <w:r>
-        <w:t xml:space="preserve">“Using AI to Determine Space Group from Neutron Powder Diffraction Data”</w:t>
-      </w:r>
-      <w:r>
-        <w:t xml:space="preserve">, ACNS Meeting, Boulder</w:t>
-      </w:r>
-    </w:p>
-    <w:p>
-      <w:pPr>
-        <w:pStyle w:val="Compact"/>
-        <w:numPr>
-          <w:ilvl w:val="0"/>
-          <w:numId w:val="1011"/>
-        </w:numPr>
-      </w:pPr>
-      <w:r>
-        <w:t xml:space="preserve">“Reinforcement Learning and Neutron Scattering”</w:t>
-      </w:r>
-      <w:r>
-        <w:t xml:space="preserve">, APS March Meeting, Chicago</w:t>
-      </w:r>
-    </w:p>
-    <w:p>
-      <w:pPr>
-        <w:pStyle w:val="Compact"/>
-        <w:numPr>
-          <w:ilvl w:val="0"/>
-          <w:numId w:val="1011"/>
-        </w:numPr>
-      </w:pPr>
-      <w:r>
-        <w:t xml:space="preserve">“APS Inclusion, Diversity, and Equity Alliance (IDEA), Transforming the Culture of Physics”</w:t>
-      </w:r>
-      <w:r>
-        <w:t xml:space="preserve">, APS March Meeting, Chicago (invited)</w:t>
-      </w:r>
-    </w:p>
-    <w:p>
-      <w:pPr>
-        <w:pStyle w:val="Compact"/>
-        <w:numPr>
-          <w:ilvl w:val="0"/>
-          <w:numId w:val="1011"/>
-        </w:numPr>
-      </w:pPr>
-      <w:r>
-        <w:t xml:space="preserve">“Inelastic Neutron Scattering”</w:t>
-      </w:r>
-      <w:r>
-        <w:t xml:space="preserve">, APS March Meeting, Chicago (invited DMP Short Course Lecture)</w:t>
-      </w:r>
-    </w:p>
-    <w:bookmarkEnd w:id="38"/>
-    <w:bookmarkStart w:id="39" w:name="section-5"/>
+        <w:t xml:space="preserve">2010</w:t>
+      </w:r>
+    </w:p>
+    <w:p>
+      <w:pPr>
+        <w:pStyle w:val="Compact"/>
+        <w:numPr>
+          <w:ilvl w:val="0"/>
+          <w:numId w:val="1023"/>
+        </w:numPr>
+      </w:pPr>
+      <w:r>
+        <w:t xml:space="preserve">“The Magnetic Form Factor in SrFe2As2”</w:t>
+      </w:r>
+      <w:r>
+        <w:t xml:space="preserve">, MMM, Atlanta, Georgia</w:t>
+      </w:r>
+    </w:p>
+    <w:p>
+      <w:pPr>
+        <w:pStyle w:val="Compact"/>
+        <w:numPr>
+          <w:ilvl w:val="0"/>
+          <w:numId w:val="1023"/>
+        </w:numPr>
+      </w:pPr>
+      <w:r>
+        <w:t xml:space="preserve">“Neutron investigations of BiFeO3 Films”</w:t>
+      </w:r>
+      <w:r>
+        <w:t xml:space="preserve">, March Meeting of the American Physical Society, Portland, Oregon</w:t>
+      </w:r>
+    </w:p>
+    <w:p>
+      <w:pPr>
+        <w:pStyle w:val="Compact"/>
+        <w:numPr>
+          <w:ilvl w:val="0"/>
+          <w:numId w:val="1023"/>
+        </w:numPr>
+      </w:pPr>
+      <w:r>
+        <w:t xml:space="preserve">“Introduction to SPINAL (Spinwave Analyzer), A program for Calculating and Analyzing Spinwaves”</w:t>
+      </w:r>
+      <w:r>
+        <w:t xml:space="preserve">, American Conference on Neutron Scattering, Ottawa, Canada</w:t>
+      </w:r>
+    </w:p>
+    <w:p>
+      <w:pPr>
+        <w:pStyle w:val="Compact"/>
+        <w:numPr>
+          <w:ilvl w:val="0"/>
+          <w:numId w:val="1023"/>
+        </w:numPr>
+      </w:pPr>
+      <w:r>
+        <w:t xml:space="preserve">“BiFeO3”</w:t>
+      </w:r>
+      <w:r>
+        <w:t xml:space="preserve">, Flipper, International Workshop on Single Crystal Diffraction with Polarized Neutrons, Grenoble, France</w:t>
+      </w:r>
+    </w:p>
+    <w:p>
+      <w:pPr>
+        <w:pStyle w:val="Compact"/>
+        <w:numPr>
+          <w:ilvl w:val="0"/>
+          <w:numId w:val="1023"/>
+        </w:numPr>
+      </w:pPr>
+      <w:r>
+        <w:t xml:space="preserve">“BiFeO3”</w:t>
+      </w:r>
+      <w:r>
+        <w:t xml:space="preserve">, Aspen Winter Conference on Fundamental Physics of Ferroelectrics, Aspen, Colorado</w:t>
+      </w:r>
+    </w:p>
+    <w:bookmarkEnd w:id="39"/>
+    <w:bookmarkStart w:id="40" w:name="section-17"/>
     <w:p>
       <w:pPr>
         <w:pStyle w:val="Heading3"/>
       </w:pPr>
       <w:r>
-        <w:t xml:space="preserve">2021</w:t>
-      </w:r>
-    </w:p>
-    <w:p>
-      <w:pPr>
-        <w:pStyle w:val="Compact"/>
-        <w:numPr>
-          <w:ilvl w:val="0"/>
-          <w:numId w:val="1012"/>
-        </w:numPr>
-      </w:pPr>
-      <w:r>
-        <w:t xml:space="preserve">Opening Plenary speaker, APS-IDEA workshop</w:t>
-      </w:r>
-    </w:p>
-    <w:p>
-      <w:pPr>
-        <w:pStyle w:val="Compact"/>
-        <w:numPr>
-          <w:ilvl w:val="0"/>
-          <w:numId w:val="1012"/>
-        </w:numPr>
-      </w:pPr>
-      <w:r>
-        <w:t xml:space="preserve">“ORNL Postdoc Career Panel”</w:t>
-      </w:r>
-      <w:r>
-        <w:t xml:space="preserve">, Oak Ridge National Laboratory (invited)</w:t>
-      </w:r>
-    </w:p>
-    <w:p>
-      <w:pPr>
-        <w:pStyle w:val="Compact"/>
-        <w:numPr>
-          <w:ilvl w:val="0"/>
-          <w:numId w:val="1012"/>
-        </w:numPr>
-      </w:pPr>
-      <w:r>
-        <w:t xml:space="preserve">“Investigations of the first intrinsic topological insulator: MnBi2Te4”</w:t>
-      </w:r>
-      <w:r>
-        <w:t xml:space="preserve">, University of Maryland, College Park (virtual) (invited)</w:t>
-      </w:r>
-    </w:p>
-    <w:p>
-      <w:pPr>
-        <w:pStyle w:val="Compact"/>
-        <w:numPr>
-          <w:ilvl w:val="0"/>
-          <w:numId w:val="1012"/>
-        </w:numPr>
-      </w:pPr>
-      <w:r>
-        <w:t xml:space="preserve">“Investigations of the first intrinsic topological insulator: MnBi2Te4”</w:t>
-      </w:r>
-      <w:r>
-        <w:t xml:space="preserve">, UC Santa Cruz (virtual) (invited)</w:t>
-      </w:r>
-    </w:p>
-    <w:p>
-      <w:pPr>
-        <w:pStyle w:val="Compact"/>
-        <w:numPr>
-          <w:ilvl w:val="0"/>
-          <w:numId w:val="1012"/>
-        </w:numPr>
-      </w:pPr>
-      <w:r>
-        <w:t xml:space="preserve">“Reinforcement Learning to optimize crystal structure determination”</w:t>
-      </w:r>
-      <w:r>
-        <w:t xml:space="preserve">, March Meeting of the American Physical Society, Nashville, TN (virtual)</w:t>
-      </w:r>
-    </w:p>
-    <w:bookmarkEnd w:id="39"/>
-    <w:bookmarkStart w:id="40" w:name="section-6"/>
+        <w:t xml:space="preserve">2009</w:t>
+      </w:r>
+    </w:p>
+    <w:p>
+      <w:pPr>
+        <w:pStyle w:val="Compact"/>
+        <w:numPr>
+          <w:ilvl w:val="0"/>
+          <w:numId w:val="1024"/>
+        </w:numPr>
+      </w:pPr>
+      <w:r>
+        <w:t xml:space="preserve">“Neutron Scattering Studies of the Fe-Based Superconductors”</w:t>
+      </w:r>
+      <w:r>
+        <w:t xml:space="preserve">, National Conference of Black Physicists, Nashville (invited)</w:t>
+      </w:r>
+    </w:p>
+    <w:bookmarkEnd w:id="40"/>
+    <w:bookmarkStart w:id="41" w:name="section-18"/>
     <w:p>
       <w:pPr>
         <w:pStyle w:val="Heading3"/>
       </w:pPr>
       <w:r>
-        <w:t xml:space="preserve">2020</w:t>
-      </w:r>
-    </w:p>
-    <w:p>
-      <w:pPr>
-        <w:pStyle w:val="Compact"/>
-        <w:numPr>
-          <w:ilvl w:val="0"/>
-          <w:numId w:val="1013"/>
-        </w:numPr>
-      </w:pPr>
-      <w:r>
-        <w:t xml:space="preserve">“Investigations of the first intrinsic topological insulator: MnBi2Te4”</w:t>
-      </w:r>
-      <w:r>
-        <w:t xml:space="preserve">, Fayetteville State University (virtual) (invited)</w:t>
-      </w:r>
-    </w:p>
-    <w:p>
-      <w:pPr>
-        <w:pStyle w:val="Compact"/>
-        <w:numPr>
-          <w:ilvl w:val="0"/>
-          <w:numId w:val="1013"/>
-        </w:numPr>
-      </w:pPr>
-      <w:r>
-        <w:t xml:space="preserve">“DPOLY Short course Machine Learning for Polymer Physicists: Neural Networks”</w:t>
-      </w:r>
-      <w:r>
-        <w:t xml:space="preserve">, March Meeting of the American Physical Society, Denver, CO</w:t>
-      </w:r>
-    </w:p>
-    <w:p>
-      <w:pPr>
-        <w:pStyle w:val="Compact"/>
-        <w:numPr>
-          <w:ilvl w:val="0"/>
-          <w:numId w:val="1013"/>
-        </w:numPr>
-      </w:pPr>
-      <w:r>
-        <w:t xml:space="preserve">“Red Cross Fire Risk”</w:t>
-      </w:r>
-      <w:r>
-        <w:t xml:space="preserve">, JSM 2020 Virtual Conference</w:t>
-      </w:r>
-    </w:p>
-    <w:p>
-      <w:pPr>
-        <w:pStyle w:val="Compact"/>
-        <w:numPr>
-          <w:ilvl w:val="0"/>
-          <w:numId w:val="1013"/>
-        </w:numPr>
-      </w:pPr>
-      <w:r>
-        <w:t xml:space="preserve">“Experimental Aspects of magnetic structure determination”</w:t>
-      </w:r>
-      <w:r>
-        <w:t xml:space="preserve">, Virtual Workshop on Magnetic Structures, Oak Ridge National Laboratory (virtual)</w:t>
-      </w:r>
-    </w:p>
-    <w:bookmarkEnd w:id="40"/>
-    <w:bookmarkStart w:id="41" w:name="section-7"/>
+        <w:t xml:space="preserve">2008</w:t>
+      </w:r>
+    </w:p>
+    <w:p>
+      <w:pPr>
+        <w:pStyle w:val="Compact"/>
+        <w:numPr>
+          <w:ilvl w:val="0"/>
+          <w:numId w:val="1025"/>
+        </w:numPr>
+      </w:pPr>
+      <w:r>
+        <w:t xml:space="preserve">“Dimensional Crossover in ZnMn2O4”</w:t>
+      </w:r>
+      <w:r>
+        <w:t xml:space="preserve">, March Meeting of the American Physical Society, New Orleans, Louisiana</w:t>
+      </w:r>
+    </w:p>
+    <w:p>
+      <w:pPr>
+        <w:pStyle w:val="Compact"/>
+        <w:numPr>
+          <w:ilvl w:val="0"/>
+          <w:numId w:val="1025"/>
+        </w:numPr>
+      </w:pPr>
+      <w:r>
+        <w:t xml:space="preserve">“Dimensional Crossover in ZnMn2O4”</w:t>
+      </w:r>
+      <w:r>
+        <w:t xml:space="preserve">, ACNS, Santa Fe, New Mexico</w:t>
+      </w:r>
+    </w:p>
+    <w:p>
+      <w:pPr>
+        <w:pStyle w:val="Compact"/>
+        <w:numPr>
+          <w:ilvl w:val="0"/>
+          <w:numId w:val="1025"/>
+        </w:numPr>
+      </w:pPr>
+      <w:r>
+        <w:t xml:space="preserve">“BiFeO3”</w:t>
+      </w:r>
+      <w:r>
+        <w:t xml:space="preserve">, PNCMI, Mito, Japan (invited)</w:t>
+      </w:r>
+    </w:p>
+    <w:bookmarkEnd w:id="41"/>
+    <w:bookmarkStart w:id="42" w:name="section-19"/>
     <w:p>
       <w:pPr>
         <w:pStyle w:val="Heading3"/>
       </w:pPr>
       <w:r>
-        <w:t xml:space="preserve">2019</w:t>
-      </w:r>
-    </w:p>
-    <w:p>
-      <w:pPr>
-        <w:pStyle w:val="Compact"/>
-        <w:numPr>
-          <w:ilvl w:val="0"/>
-          <w:numId w:val="1014"/>
-        </w:numPr>
-      </w:pPr>
-      <w:r>
-        <w:t xml:space="preserve">“Neutron Investigations of the Multiferroic Skyrmion GaV4S8”</w:t>
-      </w:r>
-      <w:r>
-        <w:t xml:space="preserve">, March Meeting of the American Physical Society, Boston, MA</w:t>
-      </w:r>
-    </w:p>
-    <w:p>
-      <w:pPr>
-        <w:pStyle w:val="Compact"/>
-        <w:numPr>
-          <w:ilvl w:val="0"/>
-          <w:numId w:val="1014"/>
-        </w:numPr>
-      </w:pPr>
-      <w:r>
-        <w:t xml:space="preserve">“Neutron Investigations of the Multiferroic Skyrmion GaV4S8”</w:t>
-      </w:r>
-      <w:r>
-        <w:t xml:space="preserve">, Strongly Correlated Electronic Systems Conference, Okayama, Japan</w:t>
-      </w:r>
-    </w:p>
-    <w:bookmarkEnd w:id="41"/>
-    <w:bookmarkStart w:id="42" w:name="section-8"/>
+        <w:t xml:space="preserve">2007</w:t>
+      </w:r>
+    </w:p>
+    <w:p>
+      <w:pPr>
+        <w:pStyle w:val="Compact"/>
+        <w:numPr>
+          <w:ilvl w:val="0"/>
+          <w:numId w:val="1026"/>
+        </w:numPr>
+      </w:pPr>
+      <w:r>
+        <w:t xml:space="preserve">“Elucidation on the effects of hydrostatic pressure on multiferroic, HoMn2O5”</w:t>
+      </w:r>
+      <w:r>
+        <w:t xml:space="preserve">, March Meeting of the American Physical Society, Denver</w:t>
+      </w:r>
+    </w:p>
+    <w:p>
+      <w:pPr>
+        <w:pStyle w:val="Compact"/>
+        <w:numPr>
+          <w:ilvl w:val="0"/>
+          <w:numId w:val="1026"/>
+        </w:numPr>
+      </w:pPr>
+      <w:r>
+        <w:t xml:space="preserve">“A New Magnet, ZnMn2O4”</w:t>
+      </w:r>
+      <w:r>
+        <w:t xml:space="preserve">, National Conference of Black Physicists, Boston (invited)</w:t>
+      </w:r>
+    </w:p>
+    <w:bookmarkEnd w:id="42"/>
+    <w:bookmarkStart w:id="43" w:name="section-20"/>
     <w:p>
       <w:pPr>
         <w:pStyle w:val="Heading3"/>
       </w:pPr>
       <w:r>
-        <w:t xml:space="preserve">2018</w:t>
-      </w:r>
-    </w:p>
-    <w:p>
-      <w:pPr>
-        <w:pStyle w:val="Compact"/>
-        <w:numPr>
-          <w:ilvl w:val="0"/>
-          <w:numId w:val="1015"/>
-        </w:numPr>
-      </w:pPr>
-      <w:r>
-        <w:t xml:space="preserve">“Neutron Investigations of Thin Film Ho2Ti2O7”</w:t>
-      </w:r>
-      <w:r>
-        <w:t xml:space="preserve">, March Meeting of the American Physical Society, Los Angeles, CA</w:t>
-      </w:r>
-    </w:p>
-    <w:p>
-      <w:pPr>
-        <w:pStyle w:val="Compact"/>
-        <w:numPr>
-          <w:ilvl w:val="0"/>
-          <w:numId w:val="1015"/>
-        </w:numPr>
-      </w:pPr>
-      <w:r>
-        <w:t xml:space="preserve">“Mechanical control of the band structure of MoTe2”</w:t>
-      </w:r>
-      <w:r>
-        <w:t xml:space="preserve">, Telluride, Telluride, Colorado</w:t>
-      </w:r>
-    </w:p>
-    <w:p>
-      <w:pPr>
-        <w:pStyle w:val="Compact"/>
-        <w:numPr>
-          <w:ilvl w:val="0"/>
-          <w:numId w:val="1015"/>
-        </w:numPr>
-      </w:pPr>
-      <w:r>
-        <w:t xml:space="preserve">“Using neutron scattering to understand solid state materials”</w:t>
-      </w:r>
-      <w:r>
-        <w:t xml:space="preserve">, Corning Research, Sunnyvale, CA (invited)</w:t>
-      </w:r>
-    </w:p>
-    <w:p>
-      <w:pPr>
-        <w:pStyle w:val="Compact"/>
-        <w:numPr>
-          <w:ilvl w:val="0"/>
-          <w:numId w:val="1015"/>
-        </w:numPr>
-      </w:pPr>
-      <w:r>
-        <w:t xml:space="preserve">“Neutron Investigations of the Multiferroic Skyrmion GaV4S8”</w:t>
-      </w:r>
-      <w:r>
-        <w:t xml:space="preserve">, International Conference on Magnetism, San Francisco, CA</w:t>
-      </w:r>
-    </w:p>
-    <w:p>
-      <w:pPr>
-        <w:pStyle w:val="Compact"/>
-        <w:numPr>
-          <w:ilvl w:val="0"/>
-          <w:numId w:val="1015"/>
-        </w:numPr>
-      </w:pPr>
-      <w:r>
-        <w:t xml:space="preserve">“Multiferroic LuFeO3: Adventures in Neutron Scattering”</w:t>
-      </w:r>
-      <w:r>
-        <w:t xml:space="preserve">, Howard University, Department of Chemistry (invited)</w:t>
-      </w:r>
-    </w:p>
-    <w:bookmarkEnd w:id="42"/>
-    <w:bookmarkStart w:id="43" w:name="section-9"/>
+        <w:t xml:space="preserve">2006</w:t>
+      </w:r>
+    </w:p>
+    <w:p>
+      <w:pPr>
+        <w:pStyle w:val="Compact"/>
+        <w:numPr>
+          <w:ilvl w:val="0"/>
+          <w:numId w:val="1027"/>
+        </w:numPr>
+      </w:pPr>
+      <w:r>
+        <w:t xml:space="preserve">“The low dimensional magnet, ZnMn2O4”</w:t>
+      </w:r>
+      <w:r>
+        <w:t xml:space="preserve">, March Meeting of the American Physical Society, Baltimore, Maryland</w:t>
+      </w:r>
+    </w:p>
+    <w:bookmarkEnd w:id="43"/>
+    <w:bookmarkStart w:id="44" w:name="section-21"/>
     <w:p>
       <w:pPr>
         <w:pStyle w:val="Heading3"/>
       </w:pPr>
       <w:r>
-        <w:t xml:space="preserve">2017</w:t>
-      </w:r>
-    </w:p>
-    <w:p>
-      <w:pPr>
-        <w:pStyle w:val="Compact"/>
-        <w:numPr>
-          <w:ilvl w:val="0"/>
-          <w:numId w:val="1016"/>
-        </w:numPr>
-      </w:pPr>
-      <w:r>
-        <w:t xml:space="preserve">“Effects of Electric Field on the magnetic structure of multiferroic (Sm,Bi)FeO3 films”</w:t>
-      </w:r>
-      <w:r>
-        <w:t xml:space="preserve">, March Meeting of the American Physical Society, New Orleans, LA</w:t>
-      </w:r>
-    </w:p>
-    <w:p>
-      <w:pPr>
-        <w:pStyle w:val="Compact"/>
-        <w:numPr>
-          <w:ilvl w:val="0"/>
-          <w:numId w:val="1016"/>
-        </w:numPr>
-      </w:pPr>
-      <w:r>
-        <w:t xml:space="preserve">“Magnetic structures and dynamics of multiferroic systems obtained with neutron scattering”</w:t>
-      </w:r>
-      <w:r>
-        <w:t xml:space="preserve">, Mid-Atlantic Sectional Meeting, Newark, NJ (invited)</w:t>
-      </w:r>
-    </w:p>
-    <w:p>
-      <w:pPr>
-        <w:pStyle w:val="Compact"/>
-        <w:numPr>
-          <w:ilvl w:val="0"/>
-          <w:numId w:val="1016"/>
-        </w:numPr>
-      </w:pPr>
-      <w:r>
-        <w:t xml:space="preserve">“Multiferroic h-LuFeO3–adventures in Neutron Scattering”</w:t>
-      </w:r>
-      <w:r>
-        <w:t xml:space="preserve">, Pittsburgh Diffraction Society, Indiana, PA (invited)</w:t>
-      </w:r>
-    </w:p>
-    <w:p>
-      <w:pPr>
-        <w:pStyle w:val="Compact"/>
-        <w:numPr>
-          <w:ilvl w:val="0"/>
-          <w:numId w:val="1016"/>
-        </w:numPr>
-      </w:pPr>
-      <w:r>
-        <w:t xml:space="preserve">“Neutron Investigations of thin film Ho2Ti2O7”</w:t>
-      </w:r>
-      <w:r>
-        <w:t xml:space="preserve">, Quantum Materials Symposium 2017, Berlin, Germany</w:t>
-      </w:r>
-    </w:p>
-    <w:bookmarkEnd w:id="43"/>
-    <w:bookmarkStart w:id="44" w:name="section-10"/>
+        <w:t xml:space="preserve">2005</w:t>
+      </w:r>
+    </w:p>
+    <w:p>
+      <w:pPr>
+        <w:pStyle w:val="Compact"/>
+        <w:numPr>
+          <w:ilvl w:val="0"/>
+          <w:numId w:val="1028"/>
+        </w:numPr>
+      </w:pPr>
+      <w:r>
+        <w:t xml:space="preserve">“The Giant Magnetoelectric, DyMn2O5”</w:t>
+      </w:r>
+      <w:r>
+        <w:t xml:space="preserve">, March Meeting of the American Physical Society, Los Angeles, California</w:t>
+      </w:r>
+    </w:p>
+    <w:bookmarkEnd w:id="44"/>
+    <w:bookmarkStart w:id="45" w:name="section-22"/>
     <w:p>
       <w:pPr>
         <w:pStyle w:val="Heading3"/>
       </w:pPr>
       <w:r>
-        <w:t xml:space="preserve">2016</w:t>
-      </w:r>
-    </w:p>
-    <w:p>
-      <w:pPr>
-        <w:pStyle w:val="Compact"/>
-        <w:numPr>
-          <w:ilvl w:val="0"/>
-          <w:numId w:val="1017"/>
-        </w:numPr>
-      </w:pPr>
-      <w:r>
-        <w:t xml:space="preserve">“Bayesian Library for the Analysis of Neutron Diffraction Data”</w:t>
-      </w:r>
-      <w:r>
-        <w:t xml:space="preserve">, March Meeting of the American Physical Society, Baltimore, MD</w:t>
-      </w:r>
-    </w:p>
-    <w:p>
-      <w:pPr>
-        <w:pStyle w:val="Compact"/>
-        <w:numPr>
-          <w:ilvl w:val="0"/>
-          <w:numId w:val="1017"/>
-        </w:numPr>
-      </w:pPr>
-      <w:r>
-        <w:t xml:space="preserve">“Bayesian Library for the Analysis of Neutron Diffraction Data (BLAND)”</w:t>
-      </w:r>
-      <w:r>
-        <w:t xml:space="preserve">, American Conference on Neutron Scattering</w:t>
-      </w:r>
-    </w:p>
-    <w:p>
-      <w:pPr>
-        <w:pStyle w:val="Compact"/>
-        <w:numPr>
-          <w:ilvl w:val="0"/>
-          <w:numId w:val="1017"/>
-        </w:numPr>
-      </w:pPr>
-      <w:r>
-        <w:t xml:space="preserve">“Bayesian Library for the Analysis of Neutron Diffraction Data”</w:t>
-      </w:r>
-      <w:r>
-        <w:t xml:space="preserve">, American Crystallography Association, Denver</w:t>
-      </w:r>
-    </w:p>
-    <w:p>
-      <w:pPr>
-        <w:pStyle w:val="Compact"/>
-        <w:numPr>
-          <w:ilvl w:val="0"/>
-          <w:numId w:val="1017"/>
-        </w:numPr>
-      </w:pPr>
-      <w:r>
-        <w:t xml:space="preserve">“Atomically engineered ferroic layers yield a room temperature magnetoelectric multiferroic”</w:t>
-      </w:r>
-      <w:r>
-        <w:t xml:space="preserve">, Gordon Conference on Multiferroics, Lewiston, Maine</w:t>
-      </w:r>
-    </w:p>
-    <w:p>
-      <w:pPr>
-        <w:pStyle w:val="Compact"/>
-        <w:numPr>
-          <w:ilvl w:val="0"/>
-          <w:numId w:val="1017"/>
-        </w:numPr>
-      </w:pPr>
-      <w:r>
-        <w:t xml:space="preserve">“Atomically engineered ferroic layers yield a room temperature magnetoelectric multiferroic”</w:t>
-      </w:r>
-      <w:r>
-        <w:t xml:space="preserve">, Quantum Materials Synthesis Conference, New York Academies of Science, New York</w:t>
-      </w:r>
-    </w:p>
-    <w:p>
-      <w:pPr>
-        <w:pStyle w:val="Compact"/>
-        <w:numPr>
-          <w:ilvl w:val="0"/>
-          <w:numId w:val="1017"/>
-        </w:numPr>
-      </w:pPr>
-      <w:r>
-        <w:t xml:space="preserve">Invited Lecturer, Magnetic Structure Determination from Neutron Data, Florida State University, Tallahassee, FL</w:t>
-      </w:r>
-    </w:p>
-    <w:bookmarkEnd w:id="44"/>
-    <w:bookmarkStart w:id="45" w:name="section-11"/>
+        <w:t xml:space="preserve">2004</w:t>
+      </w:r>
+    </w:p>
+    <w:p>
+      <w:pPr>
+        <w:pStyle w:val="Compact"/>
+        <w:numPr>
+          <w:ilvl w:val="0"/>
+          <w:numId w:val="1029"/>
+        </w:numPr>
+      </w:pPr>
+      <w:r>
+        <w:t xml:space="preserve">“The Giant Magnetoelectric, DyMn2O5”</w:t>
+      </w:r>
+      <w:r>
+        <w:t xml:space="preserve">, American Conference on Neutron Scattering, College Park, Maryland</w:t>
+      </w:r>
+    </w:p>
+    <w:p>
+      <w:pPr>
+        <w:pStyle w:val="Compact"/>
+        <w:numPr>
+          <w:ilvl w:val="0"/>
+          <w:numId w:val="1029"/>
+        </w:numPr>
+      </w:pPr>
+      <w:r>
+        <w:t xml:space="preserve">“The Magnetic Structure of ZnCr2O4”</w:t>
+      </w:r>
+      <w:r>
+        <w:t xml:space="preserve">, March Meeting of the American Physical Society, Montreal, Canada</w:t>
+      </w:r>
+    </w:p>
+    <w:bookmarkEnd w:id="45"/>
+    <w:bookmarkStart w:id="46" w:name="section-23"/>
     <w:p>
       <w:pPr>
         <w:pStyle w:val="Heading3"/>
       </w:pPr>
       <w:r>
-        <w:t xml:space="preserve">2015</w:t>
-      </w:r>
-    </w:p>
-    <w:p>
-      <w:pPr>
-        <w:pStyle w:val="Compact"/>
-        <w:numPr>
-          <w:ilvl w:val="0"/>
-          <w:numId w:val="1018"/>
-        </w:numPr>
-      </w:pPr>
-      <w:r>
-        <w:t xml:space="preserve">“Neutron scattering investigations of bulk and thin film multiferroic LuFeO3”</w:t>
-      </w:r>
-      <w:r>
-        <w:t xml:space="preserve">, International Conference on Magnetism, Barcelona, Spain</w:t>
-      </w:r>
-    </w:p>
-    <w:p>
-      <w:pPr>
-        <w:pStyle w:val="Compact"/>
-        <w:numPr>
-          <w:ilvl w:val="0"/>
-          <w:numId w:val="1018"/>
-        </w:numPr>
-      </w:pPr>
-      <w:r>
-        <w:t xml:space="preserve">“Neutron investigations of multiferroic LuFeO3”</w:t>
-      </w:r>
-      <w:r>
-        <w:t xml:space="preserve">, American Crystallography Association, Philadelphia</w:t>
-      </w:r>
-    </w:p>
-    <w:p>
-      <w:pPr>
-        <w:pStyle w:val="Compact"/>
-        <w:numPr>
-          <w:ilvl w:val="0"/>
-          <w:numId w:val="1018"/>
-        </w:numPr>
-      </w:pPr>
-      <w:r>
-        <w:t xml:space="preserve">“The intrinsic magnetic structure and ordering of multiferroic h-LuFeO3 Films”</w:t>
-      </w:r>
-      <w:r>
-        <w:t xml:space="preserve">, March Meeting of the American Physical Society, San Antonio, TX</w:t>
-      </w:r>
-    </w:p>
-    <w:bookmarkEnd w:id="45"/>
-    <w:bookmarkStart w:id="46" w:name="section-12"/>
+        <w:t xml:space="preserve">2003</w:t>
+      </w:r>
+    </w:p>
+    <w:p>
+      <w:pPr>
+        <w:pStyle w:val="Compact"/>
+        <w:numPr>
+          <w:ilvl w:val="0"/>
+          <w:numId w:val="1030"/>
+        </w:numPr>
+      </w:pPr>
+      <w:r>
+        <w:t xml:space="preserve">“Frustration in Flatland Revisited”</w:t>
+      </w:r>
+      <w:r>
+        <w:t xml:space="preserve">, Poster, Boulder Summer School for Condensed Matter Physics, Boulder, Colorado</w:t>
+      </w:r>
+    </w:p>
+    <w:bookmarkEnd w:id="46"/>
+    <w:bookmarkStart w:id="47" w:name="section-24"/>
     <w:p>
       <w:pPr>
         <w:pStyle w:val="Heading3"/>
       </w:pPr>
       <w:r>
-        <w:t xml:space="preserve">2014</w:t>
-      </w:r>
-    </w:p>
-    <w:p>
-      <w:pPr>
-        <w:pStyle w:val="Compact"/>
-        <w:numPr>
-          <w:ilvl w:val="0"/>
-          <w:numId w:val="1019"/>
-        </w:numPr>
-      </w:pPr>
-      <w:r>
-        <w:t xml:space="preserve">“Neutron Investigations of Multiferroic LuFeO3”</w:t>
-      </w:r>
-      <w:r>
-        <w:t xml:space="preserve">, Gordon Research Conference, Biddeford, ME</w:t>
-      </w:r>
-    </w:p>
-    <w:p>
-      <w:pPr>
-        <w:pStyle w:val="Compact"/>
-        <w:numPr>
-          <w:ilvl w:val="0"/>
-          <w:numId w:val="1019"/>
-        </w:numPr>
-      </w:pPr>
-      <w:r>
-        <w:t xml:space="preserve">“Neutron diffraction investigations of BiFeO3”</w:t>
-      </w:r>
-      <w:r>
-        <w:t xml:space="preserve">, Polarized Neutrons for Condensed Matter Investigations, U. Sydney, Sydney, Australia (invited)</w:t>
-      </w:r>
-    </w:p>
-    <w:p>
-      <w:pPr>
-        <w:pStyle w:val="Compact"/>
-        <w:numPr>
-          <w:ilvl w:val="0"/>
-          <w:numId w:val="1019"/>
-        </w:numPr>
-      </w:pPr>
-      <w:r>
-        <w:t xml:space="preserve">Invited Lecturer, Magnetic Structure Determination from Neutron Data, Oak Ridge National Lab, Knoxville, TN</w:t>
-      </w:r>
-    </w:p>
-    <w:p>
-      <w:pPr>
-        <w:pStyle w:val="Compact"/>
-        <w:numPr>
-          <w:ilvl w:val="0"/>
-          <w:numId w:val="1019"/>
-        </w:numPr>
-      </w:pPr>
-      <w:r>
-        <w:t xml:space="preserve">“Neutron Investigations of Multiferroic LuFeO3 Thin Films”</w:t>
-      </w:r>
-      <w:r>
-        <w:t xml:space="preserve">, American Conference on Neutron Scattering, Knoxville, TN</w:t>
-      </w:r>
-    </w:p>
-    <w:p>
-      <w:pPr>
-        <w:pStyle w:val="Compact"/>
-        <w:numPr>
-          <w:ilvl w:val="0"/>
-          <w:numId w:val="1019"/>
-        </w:numPr>
-      </w:pPr>
-      <w:r>
-        <w:t xml:space="preserve">“Neutron Investigations of Multiferroic LuFe1-xMnxO3”</w:t>
-      </w:r>
-      <w:r>
-        <w:t xml:space="preserve">, March Meeting of the American Physical Society, Denver</w:t>
-      </w:r>
-    </w:p>
-    <w:p>
-      <w:pPr>
-        <w:pStyle w:val="Compact"/>
-        <w:numPr>
-          <w:ilvl w:val="0"/>
-          <w:numId w:val="1019"/>
-        </w:numPr>
-      </w:pPr>
-      <w:r>
-        <w:t xml:space="preserve">“Neutron Investigations of Multiferroic LuFe1-xMnxO3”</w:t>
-      </w:r>
-      <w:r>
-        <w:t xml:space="preserve">, Magnetic North IV, Victoria, British Columbia, Canada</w:t>
-      </w:r>
-    </w:p>
-    <w:bookmarkEnd w:id="46"/>
-    <w:bookmarkStart w:id="47" w:name="section-13"/>
+        <w:t xml:space="preserve">2002</w:t>
+      </w:r>
+    </w:p>
+    <w:p>
+      <w:pPr>
+        <w:pStyle w:val="Compact"/>
+        <w:numPr>
+          <w:ilvl w:val="0"/>
+          <w:numId w:val="1031"/>
+        </w:numPr>
+      </w:pPr>
+      <w:r>
+        <w:t xml:space="preserve">“Magnetism of Sr(Ti,Co)O3”</w:t>
+      </w:r>
+      <w:r>
+        <w:t xml:space="preserve">, Poster, Gordon Research Conference on Strongly Correlated Electrons, Maine</w:t>
+      </w:r>
+    </w:p>
+    <w:p>
+      <w:pPr>
+        <w:pStyle w:val="Compact"/>
+        <w:numPr>
+          <w:ilvl w:val="0"/>
+          <w:numId w:val="1031"/>
+        </w:numPr>
+      </w:pPr>
+      <w:r>
+        <w:t xml:space="preserve">“Magnetism of Sr(Ti,Co)O3”</w:t>
+      </w:r>
+      <w:r>
+        <w:t xml:space="preserve">, March Meeting of the American Physical Society, Indianapolis, Indiana</w:t>
+      </w:r>
+    </w:p>
+    <w:bookmarkEnd w:id="47"/>
+    <w:bookmarkStart w:id="48" w:name="section-25"/>
     <w:p>
       <w:pPr>
         <w:pStyle w:val="Heading3"/>
       </w:pPr>
       <w:r>
-        <w:t xml:space="preserve">2013</w:t>
-      </w:r>
-    </w:p>
-    <w:p>
-      <w:pPr>
-        <w:pStyle w:val="Compact"/>
-        <w:numPr>
-          <w:ilvl w:val="0"/>
-          <w:numId w:val="1020"/>
-        </w:numPr>
-      </w:pPr>
-      <w:r>
-        <w:t xml:space="preserve">“Evolution of the magnetic structure in (Sm,Bi)FeO3 Thin Films”</w:t>
-      </w:r>
-      <w:r>
-        <w:t xml:space="preserve">, March Meeting of the American Physical Society, Baltimore</w:t>
-      </w:r>
-    </w:p>
-    <w:p>
-      <w:pPr>
-        <w:pStyle w:val="Compact"/>
-        <w:numPr>
-          <w:ilvl w:val="0"/>
-          <w:numId w:val="1020"/>
-        </w:numPr>
-      </w:pPr>
-      <w:r>
-        <w:t xml:space="preserve">“Neutron Investigations of Multiferroic LuFeO3”</w:t>
-      </w:r>
-      <w:r>
-        <w:t xml:space="preserve">, Magnetism and Magnetic Materials, Denver, CO</w:t>
-      </w:r>
-    </w:p>
-    <w:p>
-      <w:pPr>
-        <w:pStyle w:val="Compact"/>
-        <w:numPr>
-          <w:ilvl w:val="0"/>
-          <w:numId w:val="1020"/>
-        </w:numPr>
-      </w:pPr>
-      <w:r>
-        <w:t xml:space="preserve">“Neutron Diffraction Investigations of Electric-Field Control of Antiferromagnetic Domains in Epitaxial BiFeO3 Thin Films”</w:t>
-      </w:r>
-      <w:r>
-        <w:t xml:space="preserve">, Fundamental Physics of Ferroelectrics and Related Materials, Ames, IA</w:t>
-      </w:r>
-    </w:p>
-    <w:bookmarkEnd w:id="47"/>
-    <w:bookmarkStart w:id="48" w:name="section-14"/>
-    <w:p>
-      <w:pPr>
-        <w:pStyle w:val="Heading3"/>
-      </w:pPr>
-      <w:r>
-        <w:t xml:space="preserve">2012</w:t>
-      </w:r>
-    </w:p>
-    <w:p>
-      <w:pPr>
-        <w:pStyle w:val="Compact"/>
-        <w:numPr>
-          <w:ilvl w:val="0"/>
-          <w:numId w:val="1021"/>
-        </w:numPr>
-      </w:pPr>
-      <w:r>
-        <w:t xml:space="preserve">Invited Lecturer, Magnetic Structure Determination from Neutron Data, Oak Ridge National Lab, Oak Ridge, TN</w:t>
-      </w:r>
-    </w:p>
-    <w:p>
-      <w:pPr>
-        <w:pStyle w:val="Compact"/>
-        <w:numPr>
-          <w:ilvl w:val="0"/>
-          <w:numId w:val="1021"/>
-        </w:numPr>
-      </w:pPr>
-      <w:r>
-        <w:t xml:space="preserve">“Neutron Diffraction Investigations of Magnetism in BiFeO3 Epitaxial Films”</w:t>
-      </w:r>
-      <w:r>
-        <w:t xml:space="preserve">, American Conference on Neutron Scattering (invited)</w:t>
-      </w:r>
-    </w:p>
-    <w:p>
-      <w:pPr>
-        <w:pStyle w:val="Compact"/>
-        <w:numPr>
-          <w:ilvl w:val="0"/>
-          <w:numId w:val="1021"/>
-        </w:numPr>
-      </w:pPr>
-      <w:r>
-        <w:t xml:space="preserve">“Investigation of Electric Field Control Antiferromagnetic Domains in Epitaxial BiFeO3 Thin Films Using Neutron Diffraction”</w:t>
-      </w:r>
-      <w:r>
-        <w:t xml:space="preserve">, March Meeting of the American Physical Society</w:t>
-      </w:r>
-    </w:p>
-    <w:p>
-      <w:pPr>
-        <w:pStyle w:val="Compact"/>
-        <w:numPr>
-          <w:ilvl w:val="0"/>
-          <w:numId w:val="1021"/>
-        </w:numPr>
-      </w:pPr>
-      <w:r>
-        <w:t xml:space="preserve">“Neutron Diffraction Investigations of Magnetism in BiFeO3 Epitaxial Films”</w:t>
-      </w:r>
-      <w:r>
-        <w:t xml:space="preserve">, DAE Solid State Physics Symposium, IIT Bombay (invited)</w:t>
+        <w:t xml:space="preserve">2001</w:t>
+      </w:r>
+    </w:p>
+    <w:p>
+      <w:pPr>
+        <w:pStyle w:val="Compact"/>
+        <w:numPr>
+          <w:ilvl w:val="0"/>
+          <w:numId w:val="1032"/>
+        </w:numPr>
+      </w:pPr>
+      <w:r>
+        <w:t xml:space="preserve">“Site-vs-Bond disorder in the geometrically frustrated magnet, ZnCr2O4”</w:t>
+      </w:r>
+      <w:r>
+        <w:t xml:space="preserve">, Poster, SCES2001, University of Michigan, Ann Arbor</w:t>
+      </w:r>
+    </w:p>
+    <w:p>
+      <w:pPr>
+        <w:pStyle w:val="Compact"/>
+        <w:numPr>
+          <w:ilvl w:val="0"/>
+          <w:numId w:val="1032"/>
+        </w:numPr>
+      </w:pPr>
+      <w:r>
+        <w:t xml:space="preserve">“Site-vs-Bond disorder in the geometrically frustrated magnet, ZnCr2O4”</w:t>
+      </w:r>
+      <w:r>
+        <w:t xml:space="preserve">, March Meeting of the APS, Seattle, Washington</w:t>
       </w:r>
     </w:p>
     <w:bookmarkEnd w:id="48"/>
-    <w:bookmarkStart w:id="49" w:name="section-15"/>
-    <w:p>
-      <w:pPr>
-        <w:pStyle w:val="Heading3"/>
-      </w:pPr>
-      <w:r>
-        <w:t xml:space="preserve">2011</w:t>
-      </w:r>
-    </w:p>
-    <w:p>
-      <w:pPr>
-        <w:pStyle w:val="Compact"/>
-        <w:numPr>
-          <w:ilvl w:val="0"/>
-          <w:numId w:val="1022"/>
-        </w:numPr>
-      </w:pPr>
-      <w:r>
-        <w:t xml:space="preserve">“Neutron Diffraction Investigations of Magnetism in BiFeO3 Epitaxial Films”</w:t>
-      </w:r>
-      <w:r>
-        <w:t xml:space="preserve">, MMM 2011, Desert Ridge, Arizona (invited)</w:t>
-      </w:r>
-    </w:p>
-    <w:p>
-      <w:pPr>
-        <w:pStyle w:val="Compact"/>
-        <w:numPr>
-          <w:ilvl w:val="0"/>
-          <w:numId w:val="1022"/>
-        </w:numPr>
-      </w:pPr>
-      <w:r>
-        <w:t xml:space="preserve">“Neutron diffraction investigations of the BiFeO3 thin films”</w:t>
-      </w:r>
-      <w:r>
-        <w:t xml:space="preserve">, European Spallation Source, Lund, Sweden (invited)</w:t>
-      </w:r>
-    </w:p>
-    <w:p>
-      <w:pPr>
-        <w:pStyle w:val="Compact"/>
-        <w:numPr>
-          <w:ilvl w:val="0"/>
-          <w:numId w:val="1022"/>
-        </w:numPr>
-      </w:pPr>
-      <w:r>
-        <w:t xml:space="preserve">“The Renaissance of Multiferroics”</w:t>
-      </w:r>
-      <w:r>
-        <w:t xml:space="preserve">, Missouri University Science Technology (invited)</w:t>
-      </w:r>
-    </w:p>
-    <w:p>
-      <w:pPr>
-        <w:pStyle w:val="Compact"/>
-        <w:numPr>
-          <w:ilvl w:val="0"/>
-          <w:numId w:val="1022"/>
-        </w:numPr>
-      </w:pPr>
-      <w:r>
-        <w:t xml:space="preserve">“The Renaissance of Multiferroics”</w:t>
-      </w:r>
-      <w:r>
-        <w:t xml:space="preserve">, Howard University (invited)</w:t>
-      </w:r>
-    </w:p>
-    <w:p>
-      <w:pPr>
-        <w:pStyle w:val="Compact"/>
-        <w:numPr>
-          <w:ilvl w:val="0"/>
-          <w:numId w:val="1022"/>
-        </w:numPr>
-      </w:pPr>
-      <w:r>
-        <w:t xml:space="preserve">“The Magnetic Form factor of SrFe2As2”</w:t>
-      </w:r>
-      <w:r>
-        <w:t xml:space="preserve">, March Meeting of the American Physical Society, Dallas, Texas</w:t>
-      </w:r>
-    </w:p>
-    <w:bookmarkEnd w:id="49"/>
-    <w:bookmarkStart w:id="50" w:name="section-16"/>
-    <w:p>
-      <w:pPr>
-        <w:pStyle w:val="Heading3"/>
-      </w:pPr>
-      <w:r>
-        <w:t xml:space="preserve">2010</w:t>
-      </w:r>
-    </w:p>
-    <w:p>
-      <w:pPr>
-        <w:pStyle w:val="Compact"/>
-        <w:numPr>
-          <w:ilvl w:val="0"/>
-          <w:numId w:val="1023"/>
-        </w:numPr>
-      </w:pPr>
-      <w:r>
-        <w:t xml:space="preserve">“The Magnetic Form Factor in SrFe2As2”</w:t>
-      </w:r>
-      <w:r>
-        <w:t xml:space="preserve">, MMM, Atlanta, Georgia</w:t>
-      </w:r>
-    </w:p>
-    <w:p>
-      <w:pPr>
-        <w:pStyle w:val="Compact"/>
-        <w:numPr>
-          <w:ilvl w:val="0"/>
-          <w:numId w:val="1023"/>
-        </w:numPr>
-      </w:pPr>
-      <w:r>
-        <w:t xml:space="preserve">“Neutron investigations of BiFeO3 Films”</w:t>
-      </w:r>
-      <w:r>
-        <w:t xml:space="preserve">, March Meeting of the American Physical Society, Portland, Oregon</w:t>
-      </w:r>
-    </w:p>
-    <w:p>
-      <w:pPr>
-        <w:pStyle w:val="Compact"/>
-        <w:numPr>
-          <w:ilvl w:val="0"/>
-          <w:numId w:val="1023"/>
-        </w:numPr>
-      </w:pPr>
-      <w:r>
-        <w:t xml:space="preserve">“Introduction to SPINAL (Spinwave Analyzer), A program for Calculating and Analyzing Spinwaves”</w:t>
-      </w:r>
-      <w:r>
-        <w:t xml:space="preserve">, American Conference on Neutron Scattering, Ottawa, Canada</w:t>
-      </w:r>
-    </w:p>
-    <w:p>
-      <w:pPr>
-        <w:pStyle w:val="Compact"/>
-        <w:numPr>
-          <w:ilvl w:val="0"/>
-          <w:numId w:val="1023"/>
-        </w:numPr>
-      </w:pPr>
-      <w:r>
-        <w:t xml:space="preserve">“BiFeO3”</w:t>
-      </w:r>
-      <w:r>
-        <w:t xml:space="preserve">, Flipper, International Workshop on Single Crystal Diffraction with Polarized Neutrons, Grenoble, France</w:t>
-      </w:r>
-    </w:p>
-    <w:p>
-      <w:pPr>
-        <w:pStyle w:val="Compact"/>
-        <w:numPr>
-          <w:ilvl w:val="0"/>
-          <w:numId w:val="1023"/>
-        </w:numPr>
-      </w:pPr>
-      <w:r>
-        <w:t xml:space="preserve">“BiFeO3”</w:t>
-      </w:r>
-      <w:r>
-        <w:t xml:space="preserve">, Aspen Winter Conference on Fundamental Physics of Ferroelectrics, Aspen, Colorado</w:t>
-      </w:r>
-    </w:p>
-    <w:bookmarkEnd w:id="50"/>
-    <w:bookmarkStart w:id="51" w:name="section-17"/>
-    <w:p>
-      <w:pPr>
-        <w:pStyle w:val="Heading3"/>
-      </w:pPr>
-      <w:r>
-        <w:t xml:space="preserve">2009</w:t>
-      </w:r>
-    </w:p>
-    <w:p>
-      <w:pPr>
-        <w:pStyle w:val="Compact"/>
-        <w:numPr>
-          <w:ilvl w:val="0"/>
-          <w:numId w:val="1024"/>
-        </w:numPr>
-      </w:pPr>
-      <w:r>
-        <w:t xml:space="preserve">“Neutron Scattering Studies of the Fe-Based Superconductors”</w:t>
-      </w:r>
-      <w:r>
-        <w:t xml:space="preserve">, National Conference of Black Physicists, Nashville (invited)</w:t>
-      </w:r>
-    </w:p>
-    <w:bookmarkEnd w:id="51"/>
-    <w:bookmarkStart w:id="52" w:name="section-18"/>
-    <w:p>
-      <w:pPr>
-        <w:pStyle w:val="Heading3"/>
-      </w:pPr>
-      <w:r>
-        <w:t xml:space="preserve">2008</w:t>
-      </w:r>
-    </w:p>
-    <w:p>
-      <w:pPr>
-        <w:pStyle w:val="Compact"/>
-        <w:numPr>
-          <w:ilvl w:val="0"/>
-          <w:numId w:val="1025"/>
-        </w:numPr>
-      </w:pPr>
-      <w:r>
-        <w:t xml:space="preserve">“Dimensional Crossover in ZnMn2O4”</w:t>
-      </w:r>
-      <w:r>
-        <w:t xml:space="preserve">, March Meeting of the American Physical Society, New Orleans, Louisiana</w:t>
-      </w:r>
-    </w:p>
-    <w:p>
-      <w:pPr>
-        <w:pStyle w:val="Compact"/>
-        <w:numPr>
-          <w:ilvl w:val="0"/>
-          <w:numId w:val="1025"/>
-        </w:numPr>
-      </w:pPr>
-      <w:r>
-        <w:t xml:space="preserve">“Dimensional Crossover in ZnMn2O4”</w:t>
-      </w:r>
-      <w:r>
-        <w:t xml:space="preserve">, ACNS, Santa Fe, New Mexico</w:t>
-      </w:r>
-    </w:p>
-    <w:p>
-      <w:pPr>
-        <w:pStyle w:val="Compact"/>
-        <w:numPr>
-          <w:ilvl w:val="0"/>
-          <w:numId w:val="1025"/>
-        </w:numPr>
-      </w:pPr>
-      <w:r>
-        <w:t xml:space="preserve">“BiFeO3”</w:t>
-      </w:r>
-      <w:r>
-        <w:t xml:space="preserve">, PNCMI, Mito, Japan (invited)</w:t>
-      </w:r>
-    </w:p>
-    <w:bookmarkEnd w:id="52"/>
-    <w:bookmarkStart w:id="53" w:name="section-19"/>
-    <w:p>
-      <w:pPr>
-        <w:pStyle w:val="Heading3"/>
-      </w:pPr>
-      <w:r>
-        <w:t xml:space="preserve">2007</w:t>
-      </w:r>
-    </w:p>
-    <w:p>
-      <w:pPr>
-        <w:pStyle w:val="Compact"/>
-        <w:numPr>
-          <w:ilvl w:val="0"/>
-          <w:numId w:val="1026"/>
-        </w:numPr>
-      </w:pPr>
-      <w:r>
-        <w:t xml:space="preserve">“Elucidation on the effects of hydrostatic pressure on multiferroic, HoMn2O5”</w:t>
-      </w:r>
-      <w:r>
-        <w:t xml:space="preserve">, March Meeting of the American Physical Society, Denver</w:t>
-      </w:r>
-    </w:p>
-    <w:p>
-      <w:pPr>
-        <w:pStyle w:val="Compact"/>
-        <w:numPr>
-          <w:ilvl w:val="0"/>
-          <w:numId w:val="1026"/>
-        </w:numPr>
-      </w:pPr>
-      <w:r>
-        <w:t xml:space="preserve">“A New Magnet, ZnMn2O4”</w:t>
-      </w:r>
-      <w:r>
-        <w:t xml:space="preserve">, National Conference of Black Physicists, Boston (invited)</w:t>
-      </w:r>
-    </w:p>
-    <w:bookmarkEnd w:id="53"/>
-    <w:bookmarkStart w:id="54" w:name="section-20"/>
-    <w:p>
-      <w:pPr>
-        <w:pStyle w:val="Heading3"/>
-      </w:pPr>
-      <w:r>
-        <w:t xml:space="preserve">2006</w:t>
-      </w:r>
-    </w:p>
-    <w:p>
-      <w:pPr>
-        <w:pStyle w:val="Compact"/>
-        <w:numPr>
-          <w:ilvl w:val="0"/>
-          <w:numId w:val="1027"/>
-        </w:numPr>
-      </w:pPr>
-      <w:r>
-        <w:t xml:space="preserve">“The low dimensional magnet, ZnMn2O4”</w:t>
-      </w:r>
-      <w:r>
-        <w:t xml:space="preserve">, March Meeting of the American Physical Society, Baltimore, Maryland</w:t>
-      </w:r>
-    </w:p>
-    <w:bookmarkEnd w:id="54"/>
-    <w:bookmarkStart w:id="55" w:name="section-21"/>
-    <w:p>
-      <w:pPr>
-        <w:pStyle w:val="Heading3"/>
-      </w:pPr>
-      <w:r>
-        <w:t xml:space="preserve">2005</w:t>
-      </w:r>
-    </w:p>
-    <w:p>
-      <w:pPr>
-        <w:pStyle w:val="Compact"/>
-        <w:numPr>
-          <w:ilvl w:val="0"/>
-          <w:numId w:val="1028"/>
-        </w:numPr>
-      </w:pPr>
-      <w:r>
-        <w:t xml:space="preserve">“The Giant Magnetoelectric, DyMn2O5”</w:t>
-      </w:r>
-      <w:r>
-        <w:t xml:space="preserve">, March Meeting of the American Physical Society, Los Angeles, California</w:t>
-      </w:r>
-    </w:p>
-    <w:bookmarkEnd w:id="55"/>
-    <w:bookmarkStart w:id="56" w:name="section-22"/>
-    <w:p>
-      <w:pPr>
-        <w:pStyle w:val="Heading3"/>
-      </w:pPr>
-      <w:r>
-        <w:t xml:space="preserve">2004</w:t>
-      </w:r>
-    </w:p>
-    <w:p>
-      <w:pPr>
-        <w:pStyle w:val="Compact"/>
-        <w:numPr>
-          <w:ilvl w:val="0"/>
-          <w:numId w:val="1029"/>
-        </w:numPr>
-      </w:pPr>
-      <w:r>
-        <w:t xml:space="preserve">“The Giant Magnetoelectric, DyMn2O5”</w:t>
-      </w:r>
-      <w:r>
-        <w:t xml:space="preserve">, American Conference on Neutron Scattering, College Park, Maryland</w:t>
-      </w:r>
-    </w:p>
-    <w:p>
-      <w:pPr>
-        <w:pStyle w:val="Compact"/>
-        <w:numPr>
-          <w:ilvl w:val="0"/>
-          <w:numId w:val="1029"/>
-        </w:numPr>
-      </w:pPr>
-      <w:r>
-        <w:t xml:space="preserve">“The Magnetic Structure of ZnCr2O4”</w:t>
-      </w:r>
-      <w:r>
-        <w:t xml:space="preserve">, March Meeting of the American Physical Society, Montreal, Canada</w:t>
-      </w:r>
-    </w:p>
-    <w:bookmarkEnd w:id="56"/>
-    <w:bookmarkStart w:id="57" w:name="section-23"/>
-    <w:p>
-      <w:pPr>
-        <w:pStyle w:val="Heading3"/>
-      </w:pPr>
-      <w:r>
-        <w:t xml:space="preserve">2003</w:t>
-      </w:r>
-    </w:p>
-    <w:p>
-      <w:pPr>
-        <w:pStyle w:val="Compact"/>
-        <w:numPr>
-          <w:ilvl w:val="0"/>
-          <w:numId w:val="1030"/>
-        </w:numPr>
-      </w:pPr>
-      <w:r>
-        <w:t xml:space="preserve">“Frustration in Flatland Revisited”</w:t>
-      </w:r>
-      <w:r>
-        <w:t xml:space="preserve">, Poster, Boulder Summer School for Condensed Matter Physics, Boulder, Colorado</w:t>
-      </w:r>
-    </w:p>
-    <w:bookmarkEnd w:id="57"/>
-    <w:bookmarkStart w:id="58" w:name="section-24"/>
-    <w:p>
-      <w:pPr>
-        <w:pStyle w:val="Heading3"/>
-      </w:pPr>
-      <w:r>
-        <w:t xml:space="preserve">2002</w:t>
-      </w:r>
-    </w:p>
-    <w:p>
-      <w:pPr>
-        <w:pStyle w:val="Compact"/>
-        <w:numPr>
-          <w:ilvl w:val="0"/>
-          <w:numId w:val="1031"/>
-        </w:numPr>
-      </w:pPr>
-      <w:r>
-        <w:t xml:space="preserve">“Magnetism of Sr(Ti,Co)O3”</w:t>
-      </w:r>
-      <w:r>
-        <w:t xml:space="preserve">, Poster, Gordon Research Conference on Strongly Correlated Electrons, Maine</w:t>
-      </w:r>
-    </w:p>
-    <w:p>
-      <w:pPr>
-        <w:pStyle w:val="Compact"/>
-        <w:numPr>
-          <w:ilvl w:val="0"/>
-          <w:numId w:val="1031"/>
-        </w:numPr>
-      </w:pPr>
-      <w:r>
-        <w:t xml:space="preserve">“Magnetism of Sr(Ti,Co)O3”</w:t>
-      </w:r>
-      <w:r>
-        <w:t xml:space="preserve">, March Meeting of the American Physical Society, Indianapolis, Indiana</w:t>
-      </w:r>
-    </w:p>
-    <w:bookmarkEnd w:id="58"/>
-    <w:bookmarkStart w:id="59" w:name="section-25"/>
-    <w:p>
-      <w:pPr>
-        <w:pStyle w:val="Heading3"/>
-      </w:pPr>
-      <w:r>
-        <w:t xml:space="preserve">2001</w:t>
-      </w:r>
-    </w:p>
-    <w:p>
-      <w:pPr>
-        <w:pStyle w:val="Compact"/>
-        <w:numPr>
-          <w:ilvl w:val="0"/>
-          <w:numId w:val="1032"/>
-        </w:numPr>
-      </w:pPr>
-      <w:r>
-        <w:t xml:space="preserve">“Site-vs-Bond disorder in the geometrically frustrated magnet, ZnCr2O4”</w:t>
-      </w:r>
-      <w:r>
-        <w:t xml:space="preserve">, Poster, SCES2001, University of Michigan, Ann Arbor</w:t>
-      </w:r>
-    </w:p>
-    <w:p>
-      <w:pPr>
-        <w:pStyle w:val="Compact"/>
-        <w:numPr>
-          <w:ilvl w:val="0"/>
-          <w:numId w:val="1032"/>
-        </w:numPr>
-      </w:pPr>
-      <w:r>
-        <w:t xml:space="preserve">“Site-vs-Bond disorder in the geometrically frustrated magnet, ZnCr2O4”</w:t>
-      </w:r>
-      <w:r>
-        <w:t xml:space="preserve">, March Meeting of the APS, Seattle, Washington</w:t>
-      </w:r>
-    </w:p>
-    <w:bookmarkEnd w:id="59"/>
-    <w:bookmarkStart w:id="60" w:name="section-26"/>
+    <w:bookmarkStart w:id="49" w:name="section-26"/>
     <w:p>
       <w:pPr>
         <w:pStyle w:val="Heading3"/>
@@ -7717,9 +7730,9 @@
         </w:pict>
       </w:r>
     </w:p>
-    <w:bookmarkEnd w:id="60"/>
-    <w:bookmarkEnd w:id="61"/>
-    <w:bookmarkStart w:id="62" w:name="instruction-experience"/>
+    <w:bookmarkEnd w:id="49"/>
+    <w:bookmarkEnd w:id="50"/>
+    <w:bookmarkStart w:id="51" w:name="instruction-experience"/>
     <w:p>
       <w:pPr>
         <w:pStyle w:val="Heading2"/>
@@ -7879,9 +7892,13 @@
         </w:pict>
       </w:r>
     </w:p>
-    <w:bookmarkEnd w:id="62"/>
-    <w:bookmarkEnd w:id="63"/>
-    <w:sectPr/>
+    <w:bookmarkEnd w:id="51"/>
+    <w:bookmarkEnd w:id="52"/>
+    <w:sectPr>
+      <w:footnotePr>
+        <w:numRestart w:val="eachSect"/>
+      </w:footnotePr>
+    </w:sectPr>
   </w:body>
 </w:document>
 </file>
@@ -8203,10 +8220,10 @@
   <w:docDefaults>
     <w:rPrDefault>
       <w:rPr>
-        <w:rFonts w:asciiTheme="minorHAnsi" w:cstheme="minorBidi" w:eastAsiaTheme="minorHAnsi" w:hAnsiTheme="minorHAnsi"/>
+        <w:rFonts w:asciiTheme="minorHAnsi" w:cstheme="minorBidi" w:eastAsiaTheme="minorEastAsia" w:hAnsiTheme="minorHAnsi"/>
         <w:sz w:val="24"/>
         <w:szCs w:val="24"/>
-        <w:lang w:bidi="ar-SA" w:eastAsia="en-US" w:val="en-US"/>
+        <w:lang w:bidi="ar-SA" w:eastAsia="zh-CN" w:val="en-US"/>
       </w:rPr>
     </w:rPrDefault>
     <w:pPrDefault>
@@ -8258,8 +8275,6 @@
     </w:pPr>
     <w:rPr>
       <w:rFonts w:asciiTheme="majorHAnsi" w:cstheme="majorBidi" w:eastAsiaTheme="majorEastAsia" w:hAnsiTheme="majorHAnsi"/>
-      <w:spacing w:val="-10"/>
-      <w:kern w:val="28"/>
       <w:sz w:val="56"/>
       <w:szCs w:val="56"/>
     </w:rPr>
@@ -8272,8 +8287,6 @@
     <w:rsid w:val="00A10FD9"/>
     <w:rPr>
       <w:rFonts w:asciiTheme="majorHAnsi" w:cstheme="majorBidi" w:eastAsiaTheme="majorEastAsia" w:hAnsiTheme="majorHAnsi"/>
-      <w:spacing w:val="-10"/>
-      <w:kern w:val="28"/>
       <w:sz w:val="56"/>
       <w:szCs w:val="56"/>
     </w:rPr>
@@ -8314,23 +8327,31 @@
   </w:style>
   <w:style w:customStyle="1" w:styleId="Author" w:type="paragraph">
     <w:name w:val="Author"/>
+    <w:basedOn w:val="Title"/>
     <w:next w:val="BodyText"/>
     <w:qFormat/>
     <w:pPr>
       <w:keepNext/>
       <w:keepLines/>
-      <w:jc w:val="center"/>
     </w:pPr>
+    <w:rPr>
+      <w:sz w:val="24"/>
+      <w:szCs w:val="24"/>
+    </w:rPr>
   </w:style>
   <w:style w:styleId="Date" w:type="paragraph">
     <w:name w:val="Date"/>
+    <w:basedOn w:val="Title"/>
     <w:next w:val="BodyText"/>
     <w:qFormat/>
     <w:pPr>
       <w:keepNext/>
       <w:keepLines/>
-      <w:jc w:val="center"/>
     </w:pPr>
+    <w:rPr>
+      <w:sz w:val="24"/>
+      <w:szCs w:val="24"/>
+    </w:rPr>
   </w:style>
   <w:style w:customStyle="1" w:styleId="AbstractTitle" w:type="paragraph">
     <w:name w:val="Abstract Title"/>
@@ -8743,13 +8764,6 @@
       </w:tblCellMar>
     </w:tblPr>
     <w:tblStylePr w:type="firstRow">
-      <w:tblPr>
-        <w:jc w:val="left"/>
-        <w:tblInd w:type="dxa" w:w="0"/>
-      </w:tblPr>
-      <w:trPr>
-        <w:jc w:val="left"/>
-      </w:trPr>
       <w:tcPr>
         <w:tcBorders>
           <w:bottom w:val="single"/>

</xml_diff>

<commit_message>
Add #108 InformedXRD (Baggett et al.) accepted at AI for Science Workshop (NeurIPS 2026 satellite); renamed from RealXRD preprint title
Co-Authored-By: Claude Opus 4.7 (1M context) <noreply@anthropic.com>
</commit_message>
<xml_diff>
--- a/william_ratcliff_cv.docx
+++ b/william_ratcliff_cv.docx
@@ -1162,6 +1162,26 @@
     <w:p>
       <w:pPr>
         <w:pStyle w:val="FirstParagraph"/>
+      </w:pPr>
+      <w:r>
+        <w:t xml:space="preserve">108.</w:t>
+      </w:r>
+      <w:r>
+        <w:t xml:space="preserve"> </w:t>
+      </w:r>
+      <w:r>
+        <w:t xml:space="preserve">“InformedXRD: Reproducible Benchmarks and Physics-Informed Evaluation for Powder Diffraction Symmetry Classification”</w:t>
+      </w:r>
+      <w:r>
+        <w:t xml:space="preserve"> </w:t>
+      </w:r>
+      <w:r>
+        <w:t xml:space="preserve">- Elizabeth J. Baggett, Edward G. Friedman, Abhishek Shetty, Derrick Chan-Sew, Vanellsa Acha, Harshita Dwarcherla, Paul Kienzle, William Ratcliff - accepted, AI for Science Workshop (NeurIPS 2026 satellite)</w:t>
+      </w:r>
+    </w:p>
+    <w:p>
+      <w:pPr>
+        <w:pStyle w:val="BodyText"/>
       </w:pPr>
       <w:r>
         <w:t xml:space="preserve">107.</w:t>

</xml_diff>

<commit_message>
Add International Triple-Axis Working Group membership (2026-present); Ratcliff leads the Machine Learning / Data Subgroup
Co-Authored-By: Claude Opus 4.7 (1M context) <noreply@anthropic.com>RealXRD preprint title

Co-Authored-By: Claude Opus 4.7 (1M context) <noreply@anthropic.com>
</commit_message>
<xml_diff>
--- a/william_ratcliff_cv.docx
+++ b/william_ratcliff_cv.docx
@@ -736,6 +736,18 @@
       </w:pPr>
       <w:r>
         <w:t xml:space="preserve">International Advisory Committee, International Conference on Magnetism (ICM) (2026-present)</w:t>
+      </w:r>
+    </w:p>
+    <w:p>
+      <w:pPr>
+        <w:pStyle w:val="Compact"/>
+        <w:numPr>
+          <w:ilvl w:val="0"/>
+          <w:numId w:val="1004"/>
+        </w:numPr>
+      </w:pPr>
+      <w:r>
+        <w:t xml:space="preserve">Member, International Triple-Axis Working Group; Lead, Machine Learning / Data Subgroup (2026-present)</w:t>
       </w:r>
     </w:p>
     <w:p>

</xml_diff>